<commit_message>
Implementación de generación de reportes con LLM y contexto estructurado
</commit_message>
<xml_diff>
--- a/03 Mineria e hidrocarburos 02 2026.docx
+++ b/03 Mineria e hidrocarburos 02 2026.docx
@@ -29,6 +29,7 @@
       <w:r>
         <w:rPr>
           <w:rFonts w:ascii="Calibri" w:hAnsi="Calibri" w:cs="Calibri"/>
+          <w:highlight w:val="cyan"/>
         </w:rPr>
         <w:t xml:space="preserve">El sector </w:t>
       </w:r>
@@ -39,66 +40,77 @@
           <w:bCs/>
           <w:i/>
           <w:iCs/>
+          <w:highlight w:val="cyan"/>
         </w:rPr>
         <w:t>minería e hidrocarburos</w:t>
       </w:r>
       <w:r>
         <w:rPr>
           <w:rFonts w:ascii="Calibri" w:hAnsi="Calibri" w:cs="Calibri"/>
+          <w:highlight w:val="cyan"/>
         </w:rPr>
         <w:t xml:space="preserve"> registró en febrero de 2026 un decrecimiento de 1,11% respecto al mismo mes del año anterior, explicado por el desempeño negativo del subsector hidrocarburos</w:t>
       </w:r>
       <w:r>
         <w:rPr>
           <w:rFonts w:ascii="Calibri" w:hAnsi="Calibri" w:cs="Calibri"/>
+          <w:highlight w:val="cyan"/>
         </w:rPr>
         <w:t xml:space="preserve"> en </w:t>
       </w:r>
       <w:r>
         <w:rPr>
           <w:rFonts w:ascii="Calibri" w:hAnsi="Calibri" w:cs="Calibri"/>
+          <w:highlight w:val="cyan"/>
         </w:rPr>
         <w:t>-</w:t>
       </w:r>
       <w:r>
         <w:rPr>
           <w:rFonts w:ascii="Calibri" w:hAnsi="Calibri" w:cs="Calibri"/>
+          <w:highlight w:val="cyan"/>
         </w:rPr>
         <w:t>9,73%</w:t>
       </w:r>
       <w:r>
         <w:rPr>
           <w:rFonts w:ascii="Calibri" w:hAnsi="Calibri" w:cs="Calibri"/>
+          <w:highlight w:val="cyan"/>
         </w:rPr>
         <w:t>,</w:t>
       </w:r>
       <w:r>
         <w:rPr>
           <w:rFonts w:ascii="Calibri" w:hAnsi="Calibri" w:cs="Calibri"/>
+          <w:highlight w:val="cyan"/>
         </w:rPr>
         <w:t xml:space="preserve"> debido a la menor producción de petróleo crudo, líquidos de gas natural y gas natural; resultado que fue atenuado por la expansión del subsector de minería metálica</w:t>
       </w:r>
       <w:r>
         <w:rPr>
           <w:rFonts w:ascii="Calibri" w:hAnsi="Calibri" w:cs="Calibri"/>
+          <w:highlight w:val="cyan"/>
         </w:rPr>
         <w:t xml:space="preserve"> en</w:t>
       </w:r>
       <w:r>
         <w:rPr>
           <w:rFonts w:ascii="Calibri" w:hAnsi="Calibri" w:cs="Calibri"/>
+          <w:highlight w:val="cyan"/>
         </w:rPr>
         <w:t xml:space="preserve"> 0,13%</w:t>
       </w:r>
       <w:r>
         <w:rPr>
           <w:rFonts w:ascii="Calibri" w:hAnsi="Calibri" w:cs="Calibri"/>
+          <w:highlight w:val="cyan"/>
         </w:rPr>
         <w:t>,</w:t>
       </w:r>
       <w:r>
         <w:rPr>
           <w:rFonts w:ascii="Calibri" w:hAnsi="Calibri" w:cs="Calibri"/>
+          <w:highlight w:val="cyan"/>
         </w:rPr>
         <w:t xml:space="preserve"> sustentado en los mayores volúmenes de producción de cobre, hierro, oro y estaño.</w:t>
       </w:r>
@@ -125,6 +137,9 @@
         </w:rPr>
       </w:pPr>
       <w:r>
+        <w:rPr>
+          <w:highlight w:val="yellow"/>
+        </w:rPr>
         <w:t xml:space="preserve">La </w:t>
       </w:r>
       <w:r>
@@ -133,348 +148,406 @@
           <w:bCs/>
           <w:i/>
           <w:iCs/>
+          <w:highlight w:val="yellow"/>
         </w:rPr>
         <w:t>minería metálica</w:t>
       </w:r>
       <w:r>
         <w:rPr>
           <w:rFonts w:ascii="Calibri" w:hAnsi="Calibri" w:cs="Calibri"/>
+          <w:highlight w:val="yellow"/>
         </w:rPr>
         <w:t xml:space="preserve"> registró una </w:t>
       </w:r>
       <w:r>
         <w:rPr>
           <w:rFonts w:ascii="Calibri" w:hAnsi="Calibri" w:cs="Calibri"/>
+          <w:highlight w:val="yellow"/>
         </w:rPr>
         <w:t xml:space="preserve">expansión </w:t>
       </w:r>
       <w:r>
         <w:rPr>
           <w:rFonts w:ascii="Calibri" w:hAnsi="Calibri" w:cs="Calibri"/>
+          <w:highlight w:val="yellow"/>
         </w:rPr>
         <w:t xml:space="preserve">de </w:t>
       </w:r>
       <w:r>
         <w:rPr>
           <w:rFonts w:ascii="Calibri" w:hAnsi="Calibri" w:cs="Calibri"/>
+          <w:highlight w:val="yellow"/>
         </w:rPr>
         <w:t>0</w:t>
       </w:r>
       <w:r>
         <w:rPr>
           <w:rFonts w:ascii="Calibri" w:hAnsi="Calibri" w:cs="Calibri"/>
+          <w:highlight w:val="yellow"/>
         </w:rPr>
         <w:t>,</w:t>
       </w:r>
       <w:r>
         <w:rPr>
           <w:rFonts w:ascii="Calibri" w:hAnsi="Calibri" w:cs="Calibri"/>
+          <w:highlight w:val="yellow"/>
         </w:rPr>
         <w:t>1</w:t>
       </w:r>
       <w:r>
         <w:rPr>
           <w:rFonts w:ascii="Calibri" w:hAnsi="Calibri" w:cs="Calibri"/>
+          <w:highlight w:val="yellow"/>
         </w:rPr>
         <w:t>3</w:t>
       </w:r>
       <w:r>
         <w:rPr>
           <w:rFonts w:ascii="Calibri" w:hAnsi="Calibri" w:cs="Calibri"/>
+          <w:highlight w:val="yellow"/>
         </w:rPr>
         <w:t xml:space="preserve">% en </w:t>
       </w:r>
       <w:r>
         <w:rPr>
           <w:rFonts w:ascii="Calibri" w:hAnsi="Calibri" w:cs="Calibri"/>
+          <w:highlight w:val="yellow"/>
         </w:rPr>
         <w:t>febrero</w:t>
       </w:r>
       <w:r>
         <w:rPr>
           <w:rFonts w:ascii="Calibri" w:hAnsi="Calibri" w:cs="Calibri"/>
+          <w:highlight w:val="yellow"/>
         </w:rPr>
         <w:t xml:space="preserve"> de 2026</w:t>
       </w:r>
       <w:r>
         <w:rPr>
           <w:rFonts w:ascii="Calibri" w:hAnsi="Calibri" w:cs="Calibri"/>
+          <w:highlight w:val="yellow"/>
         </w:rPr>
         <w:t>, explicad</w:t>
       </w:r>
       <w:r>
         <w:rPr>
           <w:rFonts w:ascii="Calibri" w:hAnsi="Calibri" w:cs="Calibri"/>
+          <w:highlight w:val="yellow"/>
         </w:rPr>
         <w:t>a</w:t>
       </w:r>
       <w:r>
         <w:rPr>
           <w:rFonts w:ascii="Calibri" w:hAnsi="Calibri" w:cs="Calibri"/>
+          <w:highlight w:val="yellow"/>
         </w:rPr>
         <w:t xml:space="preserve"> por los </w:t>
       </w:r>
       <w:r>
         <w:rPr>
           <w:rFonts w:ascii="Calibri" w:hAnsi="Calibri" w:cs="Calibri"/>
+          <w:highlight w:val="yellow"/>
         </w:rPr>
         <w:t>mayores</w:t>
       </w:r>
       <w:r>
         <w:rPr>
           <w:rFonts w:ascii="Calibri" w:hAnsi="Calibri" w:cs="Calibri"/>
+          <w:highlight w:val="yellow"/>
         </w:rPr>
         <w:t xml:space="preserve"> niveles de producción de cobre (</w:t>
       </w:r>
       <w:r>
         <w:rPr>
           <w:rFonts w:ascii="Calibri" w:hAnsi="Calibri" w:cs="Calibri"/>
+          <w:highlight w:val="yellow"/>
         </w:rPr>
         <w:t>2</w:t>
       </w:r>
       <w:r>
         <w:rPr>
           <w:rFonts w:ascii="Calibri" w:hAnsi="Calibri" w:cs="Calibri"/>
+          <w:highlight w:val="yellow"/>
         </w:rPr>
         <w:t>,</w:t>
       </w:r>
       <w:r>
         <w:rPr>
           <w:rFonts w:ascii="Calibri" w:hAnsi="Calibri" w:cs="Calibri"/>
+          <w:highlight w:val="yellow"/>
         </w:rPr>
         <w:t>57</w:t>
       </w:r>
       <w:r>
         <w:rPr>
           <w:rFonts w:ascii="Calibri" w:hAnsi="Calibri" w:cs="Calibri"/>
+          <w:highlight w:val="yellow"/>
         </w:rPr>
         <w:t xml:space="preserve">%), </w:t>
       </w:r>
       <w:r>
         <w:rPr>
           <w:rFonts w:ascii="Calibri" w:hAnsi="Calibri" w:cs="Calibri"/>
+          <w:highlight w:val="yellow"/>
         </w:rPr>
         <w:t xml:space="preserve">hierro </w:t>
       </w:r>
       <w:r>
         <w:rPr>
           <w:rFonts w:ascii="Calibri" w:hAnsi="Calibri" w:cs="Calibri"/>
+          <w:highlight w:val="yellow"/>
         </w:rPr>
         <w:t>(1,</w:t>
       </w:r>
       <w:r>
         <w:rPr>
           <w:rFonts w:ascii="Calibri" w:hAnsi="Calibri" w:cs="Calibri"/>
+          <w:highlight w:val="yellow"/>
         </w:rPr>
         <w:t>48</w:t>
       </w:r>
       <w:r>
         <w:rPr>
           <w:rFonts w:ascii="Calibri" w:hAnsi="Calibri" w:cs="Calibri"/>
+          <w:highlight w:val="yellow"/>
         </w:rPr>
         <w:t>%), oro (</w:t>
       </w:r>
       <w:r>
         <w:rPr>
           <w:rFonts w:ascii="Calibri" w:hAnsi="Calibri" w:cs="Calibri"/>
+          <w:highlight w:val="yellow"/>
         </w:rPr>
         <w:t>0</w:t>
       </w:r>
       <w:r>
         <w:rPr>
           <w:rFonts w:ascii="Calibri" w:hAnsi="Calibri" w:cs="Calibri"/>
+          <w:highlight w:val="yellow"/>
         </w:rPr>
         <w:t>,</w:t>
       </w:r>
       <w:r>
         <w:rPr>
           <w:rFonts w:ascii="Calibri" w:hAnsi="Calibri" w:cs="Calibri"/>
+          <w:highlight w:val="yellow"/>
         </w:rPr>
         <w:t>15</w:t>
       </w:r>
       <w:r>
         <w:rPr>
           <w:rFonts w:ascii="Calibri" w:hAnsi="Calibri" w:cs="Calibri"/>
+          <w:highlight w:val="yellow"/>
         </w:rPr>
         <w:t>%)</w:t>
       </w:r>
       <w:r>
         <w:rPr>
           <w:rFonts w:ascii="Calibri" w:hAnsi="Calibri" w:cs="Calibri"/>
+          <w:highlight w:val="yellow"/>
         </w:rPr>
         <w:t xml:space="preserve"> </w:t>
       </w:r>
       <w:r>
         <w:rPr>
           <w:rFonts w:ascii="Calibri" w:hAnsi="Calibri" w:cs="Calibri"/>
+          <w:highlight w:val="yellow"/>
         </w:rPr>
         <w:t>y estaño (</w:t>
       </w:r>
       <w:r>
         <w:rPr>
           <w:rFonts w:ascii="Calibri" w:hAnsi="Calibri" w:cs="Calibri"/>
+          <w:highlight w:val="yellow"/>
         </w:rPr>
         <w:t>0</w:t>
       </w:r>
       <w:r>
         <w:rPr>
           <w:rFonts w:ascii="Calibri" w:hAnsi="Calibri" w:cs="Calibri"/>
+          <w:highlight w:val="yellow"/>
         </w:rPr>
         <w:t>,</w:t>
       </w:r>
       <w:r>
         <w:rPr>
           <w:rFonts w:ascii="Calibri" w:hAnsi="Calibri" w:cs="Calibri"/>
+          <w:highlight w:val="yellow"/>
         </w:rPr>
         <w:t>51</w:t>
       </w:r>
       <w:r>
         <w:rPr>
           <w:rFonts w:ascii="Calibri" w:hAnsi="Calibri" w:cs="Calibri"/>
+          <w:highlight w:val="yellow"/>
         </w:rPr>
         <w:t>%),</w:t>
       </w:r>
       <w:r>
         <w:rPr>
           <w:rFonts w:ascii="Calibri" w:hAnsi="Calibri" w:cs="Calibri"/>
+          <w:highlight w:val="yellow"/>
         </w:rPr>
         <w:t xml:space="preserve"> con una incidencia </w:t>
       </w:r>
       <w:r>
         <w:rPr>
           <w:rFonts w:ascii="Calibri" w:hAnsi="Calibri" w:cs="Calibri"/>
+          <w:highlight w:val="yellow"/>
         </w:rPr>
         <w:t>positiva</w:t>
       </w:r>
       <w:r>
         <w:rPr>
           <w:rFonts w:ascii="Calibri" w:hAnsi="Calibri" w:cs="Calibri"/>
+          <w:highlight w:val="yellow"/>
         </w:rPr>
         <w:t xml:space="preserve"> de</w:t>
       </w:r>
       <w:r>
         <w:rPr>
           <w:rFonts w:ascii="Calibri" w:hAnsi="Calibri" w:cs="Calibri"/>
+          <w:highlight w:val="yellow"/>
         </w:rPr>
         <w:t xml:space="preserve"> </w:t>
       </w:r>
       <w:r>
         <w:rPr>
           <w:rFonts w:ascii="Calibri" w:hAnsi="Calibri" w:cs="Calibri"/>
+          <w:highlight w:val="yellow"/>
         </w:rPr>
         <w:t>1</w:t>
       </w:r>
       <w:r>
         <w:rPr>
           <w:rFonts w:ascii="Calibri" w:hAnsi="Calibri" w:cs="Calibri"/>
+          <w:highlight w:val="yellow"/>
         </w:rPr>
         <w:t>,</w:t>
       </w:r>
       <w:r>
         <w:rPr>
           <w:rFonts w:ascii="Calibri" w:hAnsi="Calibri" w:cs="Calibri"/>
+          <w:highlight w:val="yellow"/>
         </w:rPr>
         <w:t>3</w:t>
       </w:r>
       <w:r>
         <w:rPr>
           <w:rFonts w:ascii="Calibri" w:hAnsi="Calibri" w:cs="Calibri"/>
+          <w:highlight w:val="yellow"/>
         </w:rPr>
         <w:t>2</w:t>
       </w:r>
       <w:r>
         <w:rPr>
           <w:rFonts w:ascii="Calibri" w:hAnsi="Calibri" w:cs="Calibri"/>
+          <w:highlight w:val="yellow"/>
         </w:rPr>
         <w:t xml:space="preserve"> puntos porcentuales a la variación del sector; </w:t>
       </w:r>
       <w:r>
         <w:rPr>
           <w:rFonts w:ascii="Calibri" w:hAnsi="Calibri" w:cs="Calibri"/>
+          <w:highlight w:val="yellow"/>
         </w:rPr>
         <w:t>expansión limitada por la disminución en el volumen de producción de molibdeno (-</w:t>
       </w:r>
       <w:r>
         <w:rPr>
           <w:rFonts w:ascii="Calibri" w:hAnsi="Calibri" w:cs="Calibri"/>
+          <w:highlight w:val="yellow"/>
         </w:rPr>
         <w:t>9</w:t>
       </w:r>
       <w:r>
         <w:rPr>
           <w:rFonts w:ascii="Calibri" w:hAnsi="Calibri" w:cs="Calibri"/>
+          <w:highlight w:val="yellow"/>
         </w:rPr>
         <w:t>,6</w:t>
       </w:r>
       <w:r>
         <w:rPr>
           <w:rFonts w:ascii="Calibri" w:hAnsi="Calibri" w:cs="Calibri"/>
+          <w:highlight w:val="yellow"/>
         </w:rPr>
         <w:t>3</w:t>
       </w:r>
       <w:r>
         <w:rPr>
           <w:rFonts w:ascii="Calibri" w:hAnsi="Calibri" w:cs="Calibri"/>
+          <w:highlight w:val="yellow"/>
         </w:rPr>
         <w:t>%)</w:t>
       </w:r>
       <w:r>
         <w:rPr>
           <w:rFonts w:ascii="Calibri" w:hAnsi="Calibri" w:cs="Calibri"/>
+          <w:highlight w:val="yellow"/>
         </w:rPr>
         <w:t>, plata (-2,65%), plomo (-7,71%) y zinc (-1,06%)</w:t>
       </w:r>
       <w:r>
         <w:rPr>
           <w:rFonts w:ascii="Calibri" w:hAnsi="Calibri" w:cs="Calibri"/>
+          <w:highlight w:val="yellow"/>
         </w:rPr>
         <w:t xml:space="preserve">, </w:t>
       </w:r>
       <w:r>
         <w:rPr>
           <w:rFonts w:ascii="Calibri" w:hAnsi="Calibri" w:cs="Calibri"/>
+          <w:highlight w:val="yellow"/>
         </w:rPr>
         <w:t>con una</w:t>
       </w:r>
       <w:r>
         <w:rPr>
           <w:rFonts w:ascii="Calibri" w:hAnsi="Calibri" w:cs="Calibri"/>
+          <w:highlight w:val="yellow"/>
         </w:rPr>
         <w:t xml:space="preserve"> incidencia </w:t>
       </w:r>
       <w:r>
         <w:rPr>
           <w:rFonts w:ascii="Calibri" w:hAnsi="Calibri" w:cs="Calibri"/>
+          <w:highlight w:val="yellow"/>
         </w:rPr>
         <w:t xml:space="preserve">negativa </w:t>
       </w:r>
       <w:r>
         <w:rPr>
           <w:rFonts w:ascii="Calibri" w:hAnsi="Calibri" w:cs="Calibri"/>
+          <w:highlight w:val="yellow"/>
         </w:rPr>
         <w:t xml:space="preserve">de </w:t>
       </w:r>
       <w:r>
         <w:rPr>
           <w:rFonts w:ascii="Calibri" w:hAnsi="Calibri" w:cs="Calibri"/>
+          <w:highlight w:val="yellow"/>
         </w:rPr>
         <w:t>1</w:t>
       </w:r>
       <w:r>
         <w:rPr>
           <w:rFonts w:ascii="Calibri" w:hAnsi="Calibri" w:cs="Calibri"/>
+          <w:highlight w:val="yellow"/>
         </w:rPr>
         <w:t>,</w:t>
       </w:r>
       <w:r>
         <w:rPr>
           <w:rFonts w:ascii="Calibri" w:hAnsi="Calibri" w:cs="Calibri"/>
+          <w:highlight w:val="yellow"/>
         </w:rPr>
         <w:t>21</w:t>
       </w:r>
       <w:r>
         <w:rPr>
           <w:rFonts w:ascii="Calibri" w:hAnsi="Calibri" w:cs="Calibri"/>
+          <w:highlight w:val="yellow"/>
         </w:rPr>
         <w:t xml:space="preserve"> puntos porcentuales.</w:t>
       </w:r>
@@ -484,36 +557,63 @@
         <w:jc w:val="both"/>
       </w:pPr>
       <w:r>
+        <w:rPr>
+          <w:highlight w:val="red"/>
+        </w:rPr>
         <w:t xml:space="preserve">El desempeño positivo de la minería metálica en febrero de 2026 estuvo </w:t>
       </w:r>
       <w:r>
+        <w:rPr>
+          <w:highlight w:val="red"/>
+        </w:rPr>
         <w:t>sustentado</w:t>
       </w:r>
       <w:r>
+        <w:rPr>
+          <w:highlight w:val="red"/>
+        </w:rPr>
         <w:t xml:space="preserve"> en el mayor tonelaje procesado en las plantas de concentración de las principales compañías del país, entre ellas Antamina, Las Bambas, Yanacocha, </w:t>
       </w:r>
       <w:proofErr w:type="spellStart"/>
       <w:r>
+        <w:rPr>
+          <w:highlight w:val="red"/>
+        </w:rPr>
         <w:t>Shougang</w:t>
       </w:r>
       <w:proofErr w:type="spellEnd"/>
       <w:r>
+        <w:rPr>
+          <w:highlight w:val="red"/>
+        </w:rPr>
         <w:t xml:space="preserve"> Hierro Perú y </w:t>
       </w:r>
       <w:proofErr w:type="spellStart"/>
       <w:r>
+        <w:rPr>
+          <w:highlight w:val="red"/>
+        </w:rPr>
         <w:t>Minsur</w:t>
       </w:r>
       <w:proofErr w:type="spellEnd"/>
       <w:r>
+        <w:rPr>
+          <w:highlight w:val="red"/>
+        </w:rPr>
         <w:t xml:space="preserve">, que registraron mayores niveles de producción de cobre, hierro, oro y estaño. No obstante, este desempeño se vio afectado por factores de carácter climático, principalmente las intensas precipitaciones pluviales en diversas regiones mineras, que generaron restricciones en el acceso, transporte y continuidad de las operaciones. En este contexto, el Gobierno declaró el Estado de Emergencia el 24 de febrero mediante el Decreto Supremo </w:t>
       </w:r>
       <w:proofErr w:type="spellStart"/>
       <w:r>
+        <w:rPr>
+          <w:highlight w:val="red"/>
+        </w:rPr>
         <w:t>N.°</w:t>
       </w:r>
       <w:proofErr w:type="spellEnd"/>
       <w:r>
+        <w:rPr>
+          <w:highlight w:val="red"/>
+        </w:rPr>
         <w:t xml:space="preserve"> 025-2026-PCM.</w:t>
       </w:r>
     </w:p>
@@ -522,21 +622,39 @@
         <w:jc w:val="both"/>
       </w:pPr>
       <w:r>
+        <w:rPr>
+          <w:highlight w:val="yellow"/>
+        </w:rPr>
         <w:t>L</w:t>
       </w:r>
       <w:r>
+        <w:rPr>
+          <w:highlight w:val="yellow"/>
+        </w:rPr>
         <w:t>os precios de los metales en el mercado internacional</w:t>
       </w:r>
       <w:r>
+        <w:rPr>
+          <w:highlight w:val="yellow"/>
+        </w:rPr>
         <w:t>, en febrero de 2026,</w:t>
       </w:r>
       <w:r>
+        <w:rPr>
+          <w:highlight w:val="yellow"/>
+        </w:rPr>
         <w:t xml:space="preserve"> </w:t>
       </w:r>
       <w:r>
+        <w:rPr>
+          <w:highlight w:val="yellow"/>
+        </w:rPr>
         <w:t>mostraron</w:t>
       </w:r>
       <w:r>
+        <w:rPr>
+          <w:highlight w:val="yellow"/>
+        </w:rPr>
         <w:t xml:space="preserve"> en términos interanuales un comportamiento mayoritariamente al alza, con excepción del plomo. La cotización promedio del oro (73,33%) continuó mostrando incrementos significativos, alcanzando un nuevo máximo histórico y consolidando la tendencia ascendente iniciada en abril de 2023; en tanto, el precio de la plata (154,99%) registró un notable aumento, manteniendo una variación positiva sostenida desde febrero de 2024. Por su parte, el cobre (39,26%) reafirmó su crecimiento por noveno mes consecutivo, mientras que el estaño (53,14%) prolongó su tendencia alcista iniciada en junio de 2025. En la misma línea, el zinc (16,72%) acumuló siete meses consecutivos de crecimiento, a diferencia del plomo (-2,03%), que registró una variación negativa.</w:t>
       </w:r>
     </w:p>
@@ -545,11 +663,13 @@
         <w:jc w:val="both"/>
         <w:rPr>
           <w:rFonts w:cstheme="minorHAnsi"/>
+          <w:highlight w:val="yellow"/>
         </w:rPr>
       </w:pPr>
       <w:r>
         <w:rPr>
           <w:rFonts w:ascii="Calibri" w:hAnsi="Calibri" w:cs="Calibri"/>
+          <w:highlight w:val="yellow"/>
         </w:rPr>
         <w:t xml:space="preserve">La producción de </w:t>
       </w:r>
@@ -559,6 +679,7 @@
           <w:b/>
           <w:i/>
           <w:iCs/>
+          <w:highlight w:val="yellow"/>
         </w:rPr>
         <w:t>cobre</w:t>
       </w:r>
@@ -566,84 +687,98 @@
         <w:rPr>
           <w:rFonts w:ascii="Calibri" w:hAnsi="Calibri" w:cs="Calibri"/>
           <w:b/>
+          <w:highlight w:val="yellow"/>
         </w:rPr>
         <w:t xml:space="preserve"> </w:t>
       </w:r>
       <w:r>
         <w:rPr>
           <w:rFonts w:ascii="Calibri" w:hAnsi="Calibri" w:cs="Calibri"/>
+          <w:highlight w:val="yellow"/>
         </w:rPr>
         <w:t>(</w:t>
       </w:r>
       <w:r>
         <w:rPr>
           <w:rFonts w:ascii="Calibri" w:hAnsi="Calibri" w:cs="Calibri"/>
+          <w:highlight w:val="yellow"/>
         </w:rPr>
         <w:t>2</w:t>
       </w:r>
       <w:r>
         <w:rPr>
           <w:rFonts w:ascii="Calibri" w:hAnsi="Calibri" w:cs="Calibri"/>
+          <w:highlight w:val="yellow"/>
         </w:rPr>
         <w:t>,</w:t>
       </w:r>
       <w:r>
         <w:rPr>
           <w:rFonts w:ascii="Calibri" w:hAnsi="Calibri" w:cs="Calibri"/>
+          <w:highlight w:val="yellow"/>
         </w:rPr>
         <w:t>57</w:t>
       </w:r>
       <w:r>
         <w:rPr>
           <w:rFonts w:ascii="Calibri" w:hAnsi="Calibri" w:cs="Calibri"/>
+          <w:highlight w:val="yellow"/>
         </w:rPr>
         <w:t xml:space="preserve">%) </w:t>
       </w:r>
       <w:r>
         <w:rPr>
           <w:rFonts w:ascii="Calibri" w:hAnsi="Calibri" w:cs="Calibri"/>
+          <w:highlight w:val="yellow"/>
         </w:rPr>
         <w:t>registró un</w:t>
       </w:r>
       <w:r>
         <w:rPr>
           <w:rFonts w:ascii="Calibri" w:hAnsi="Calibri" w:cs="Calibri"/>
+          <w:highlight w:val="yellow"/>
         </w:rPr>
         <w:t xml:space="preserve"> crecimiento, </w:t>
       </w:r>
       <w:r>
         <w:rPr>
           <w:rFonts w:ascii="Calibri" w:hAnsi="Calibri" w:cs="Calibri"/>
+          <w:highlight w:val="yellow"/>
         </w:rPr>
         <w:t xml:space="preserve">manteniendo </w:t>
       </w:r>
       <w:r>
         <w:rPr>
           <w:rFonts w:ascii="Calibri" w:hAnsi="Calibri" w:cs="Calibri"/>
+          <w:highlight w:val="yellow"/>
         </w:rPr>
         <w:t xml:space="preserve">la tendencia </w:t>
       </w:r>
       <w:r>
         <w:rPr>
           <w:rFonts w:ascii="Calibri" w:hAnsi="Calibri" w:cs="Calibri"/>
+          <w:highlight w:val="yellow"/>
         </w:rPr>
         <w:t>positiva</w:t>
       </w:r>
       <w:r>
         <w:rPr>
           <w:rFonts w:ascii="Calibri" w:hAnsi="Calibri" w:cs="Calibri"/>
+          <w:highlight w:val="yellow"/>
         </w:rPr>
         <w:t xml:space="preserve"> </w:t>
       </w:r>
       <w:r>
         <w:rPr>
           <w:rFonts w:ascii="Calibri" w:hAnsi="Calibri" w:cs="Calibri"/>
+          <w:highlight w:val="yellow"/>
         </w:rPr>
         <w:t>iniciada el mes anterior</w:t>
       </w:r>
       <w:r>
         <w:rPr>
           <w:rFonts w:ascii="Calibri" w:hAnsi="Calibri" w:cs="Calibri"/>
+          <w:highlight w:val="yellow"/>
         </w:rPr>
         <w:t xml:space="preserve">, </w:t>
       </w:r>
@@ -651,30 +786,35 @@
       <w:r>
         <w:rPr>
           <w:rFonts w:ascii="Calibri" w:hAnsi="Calibri" w:cs="Calibri"/>
+          <w:highlight w:val="yellow"/>
         </w:rPr>
         <w:t xml:space="preserve">como resultado del </w:t>
       </w:r>
       <w:r>
         <w:rPr>
           <w:rFonts w:ascii="Calibri" w:hAnsi="Calibri" w:cs="Calibri"/>
+          <w:highlight w:val="yellow"/>
         </w:rPr>
         <w:t>mayor</w:t>
       </w:r>
       <w:r>
         <w:rPr>
           <w:rFonts w:ascii="Calibri" w:hAnsi="Calibri" w:cs="Calibri"/>
+          <w:highlight w:val="yellow"/>
         </w:rPr>
         <w:t xml:space="preserve"> nivel de extracción reportado por las compañías mineras </w:t>
       </w:r>
       <w:r>
         <w:rPr>
           <w:rFonts w:ascii="Calibri" w:hAnsi="Calibri" w:cs="Calibri"/>
+          <w:highlight w:val="yellow"/>
         </w:rPr>
         <w:t xml:space="preserve">Antamina, </w:t>
       </w:r>
       <w:r>
         <w:rPr>
           <w:rFonts w:ascii="Calibri" w:hAnsi="Calibri" w:cs="Calibri"/>
+          <w:highlight w:val="yellow"/>
         </w:rPr>
         <w:t xml:space="preserve">Las Bambas, </w:t>
       </w:r>
@@ -682,6 +822,7 @@
       <w:r>
         <w:rPr>
           <w:rFonts w:ascii="Calibri" w:hAnsi="Calibri" w:cs="Calibri"/>
+          <w:highlight w:val="yellow"/>
         </w:rPr>
         <w:t>Shouxin</w:t>
       </w:r>
@@ -689,12 +830,14 @@
       <w:r>
         <w:rPr>
           <w:rFonts w:ascii="Calibri" w:hAnsi="Calibri" w:cs="Calibri"/>
+          <w:highlight w:val="yellow"/>
         </w:rPr>
         <w:t xml:space="preserve"> Perú, </w:t>
       </w:r>
       <w:r>
         <w:rPr>
           <w:rFonts w:ascii="Calibri" w:hAnsi="Calibri" w:cs="Calibri"/>
+          <w:highlight w:val="yellow"/>
         </w:rPr>
         <w:t xml:space="preserve">Cerro Verde, </w:t>
       </w:r>
@@ -702,6 +845,7 @@
       <w:r>
         <w:rPr>
           <w:rFonts w:ascii="Calibri" w:hAnsi="Calibri" w:cs="Calibri"/>
+          <w:highlight w:val="yellow"/>
         </w:rPr>
         <w:t>Norcobre</w:t>
       </w:r>
@@ -709,6 +853,7 @@
       <w:r>
         <w:rPr>
           <w:rFonts w:ascii="Calibri" w:hAnsi="Calibri" w:cs="Calibri"/>
+          <w:highlight w:val="yellow"/>
         </w:rPr>
         <w:t xml:space="preserve">, </w:t>
       </w:r>
@@ -716,6 +861,7 @@
       <w:r>
         <w:rPr>
           <w:rFonts w:ascii="Calibri" w:hAnsi="Calibri" w:cs="Calibri"/>
+          <w:highlight w:val="yellow"/>
         </w:rPr>
         <w:t>Colquisiri</w:t>
       </w:r>
@@ -723,6 +869,7 @@
       <w:r>
         <w:rPr>
           <w:rFonts w:ascii="Calibri" w:hAnsi="Calibri" w:cs="Calibri"/>
+          <w:highlight w:val="yellow"/>
         </w:rPr>
         <w:t xml:space="preserve"> y los aportes de </w:t>
       </w:r>
@@ -730,6 +877,7 @@
       <w:r>
         <w:rPr>
           <w:rFonts w:ascii="Calibri" w:hAnsi="Calibri" w:cs="Calibri"/>
+          <w:highlight w:val="yellow"/>
         </w:rPr>
         <w:t>Argentum</w:t>
       </w:r>
@@ -737,12 +885,14 @@
       <w:r>
         <w:rPr>
           <w:rFonts w:ascii="Calibri" w:hAnsi="Calibri" w:cs="Calibri"/>
+          <w:highlight w:val="yellow"/>
         </w:rPr>
         <w:t xml:space="preserve"> y</w:t>
       </w:r>
       <w:r>
         <w:rPr>
           <w:rFonts w:ascii="Calibri" w:hAnsi="Calibri" w:cs="Calibri"/>
+          <w:highlight w:val="yellow"/>
         </w:rPr>
         <w:t xml:space="preserve"> </w:t>
       </w:r>
@@ -750,6 +900,7 @@
       <w:r>
         <w:rPr>
           <w:rFonts w:ascii="Calibri" w:hAnsi="Calibri" w:cs="Calibri"/>
+          <w:highlight w:val="yellow"/>
         </w:rPr>
         <w:t>Agromin</w:t>
       </w:r>
@@ -757,6 +908,7 @@
       <w:r>
         <w:rPr>
           <w:rFonts w:ascii="Calibri" w:hAnsi="Calibri" w:cs="Calibri"/>
+          <w:highlight w:val="yellow"/>
         </w:rPr>
         <w:t xml:space="preserve"> La Bonita</w:t>
       </w:r>
@@ -764,18 +916,21 @@
       <w:r>
         <w:rPr>
           <w:rFonts w:ascii="Calibri" w:hAnsi="Calibri" w:cs="Calibri"/>
+          <w:highlight w:val="yellow"/>
         </w:rPr>
         <w:t>.</w:t>
       </w:r>
       <w:r>
         <w:rPr>
           <w:rFonts w:ascii="Calibri" w:hAnsi="Calibri" w:cs="Calibri"/>
+          <w:highlight w:val="yellow"/>
         </w:rPr>
         <w:t xml:space="preserve"> </w:t>
       </w:r>
       <w:r>
         <w:rPr>
           <w:rFonts w:cstheme="minorHAnsi"/>
+          <w:highlight w:val="yellow"/>
         </w:rPr>
         <w:t xml:space="preserve">La producción de </w:t>
       </w:r>
@@ -785,12 +940,14 @@
           <w:b/>
           <w:i/>
           <w:iCs/>
+          <w:highlight w:val="yellow"/>
         </w:rPr>
         <w:t>hierro</w:t>
       </w:r>
       <w:r>
         <w:rPr>
           <w:rFonts w:cstheme="minorHAnsi"/>
+          <w:highlight w:val="yellow"/>
         </w:rPr>
         <w:t xml:space="preserve"> (1,48%) mantuvo su tendencia creciente, como resultado del mayor volumen procesado por la compañía minera </w:t>
       </w:r>
@@ -798,6 +955,7 @@
       <w:r>
         <w:rPr>
           <w:rFonts w:cstheme="minorHAnsi"/>
+          <w:highlight w:val="yellow"/>
         </w:rPr>
         <w:t>Shougang</w:t>
       </w:r>
@@ -805,6 +963,7 @@
       <w:r>
         <w:rPr>
           <w:rFonts w:cstheme="minorHAnsi"/>
+          <w:highlight w:val="yellow"/>
         </w:rPr>
         <w:t xml:space="preserve"> Hierro Perú. </w:t>
       </w:r>
@@ -814,11 +973,13 @@
         <w:jc w:val="both"/>
         <w:rPr>
           <w:rFonts w:ascii="Calibri" w:hAnsi="Calibri" w:cs="Calibri"/>
+          <w:highlight w:val="yellow"/>
         </w:rPr>
       </w:pPr>
       <w:r>
         <w:rPr>
           <w:rFonts w:cstheme="minorHAnsi"/>
+          <w:highlight w:val="yellow"/>
         </w:rPr>
         <w:t xml:space="preserve">La producción de </w:t>
       </w:r>
@@ -829,60 +990,70 @@
           <w:bCs/>
           <w:i/>
           <w:iCs/>
+          <w:highlight w:val="yellow"/>
         </w:rPr>
         <w:t xml:space="preserve">oro </w:t>
       </w:r>
       <w:r>
         <w:rPr>
           <w:rFonts w:cstheme="minorHAnsi"/>
+          <w:highlight w:val="yellow"/>
         </w:rPr>
         <w:t>(0,15%) registró un ligero incremento</w:t>
       </w:r>
       <w:r>
         <w:rPr>
           <w:rFonts w:cstheme="minorHAnsi"/>
+          <w:highlight w:val="yellow"/>
         </w:rPr>
         <w:t>,</w:t>
       </w:r>
       <w:r>
         <w:rPr>
           <w:rFonts w:cstheme="minorHAnsi"/>
+          <w:highlight w:val="yellow"/>
         </w:rPr>
         <w:t xml:space="preserve"> </w:t>
       </w:r>
       <w:r>
         <w:rPr>
           <w:rFonts w:cstheme="minorHAnsi"/>
+          <w:highlight w:val="yellow"/>
         </w:rPr>
         <w:t>manteniendo la tendencia al alza</w:t>
       </w:r>
       <w:r>
         <w:rPr>
           <w:rFonts w:cstheme="minorHAnsi"/>
+          <w:highlight w:val="yellow"/>
         </w:rPr>
         <w:t xml:space="preserve"> registrada </w:t>
       </w:r>
       <w:r>
         <w:rPr>
           <w:rFonts w:cstheme="minorHAnsi"/>
+          <w:highlight w:val="yellow"/>
         </w:rPr>
         <w:t>desde el</w:t>
       </w:r>
       <w:r>
         <w:rPr>
           <w:rFonts w:cstheme="minorHAnsi"/>
+          <w:highlight w:val="yellow"/>
         </w:rPr>
         <w:t xml:space="preserve"> mes anterior, impulsad</w:t>
       </w:r>
       <w:r>
         <w:rPr>
           <w:rFonts w:cstheme="minorHAnsi"/>
+          <w:highlight w:val="yellow"/>
         </w:rPr>
         <w:t xml:space="preserve">a </w:t>
       </w:r>
       <w:r>
         <w:rPr>
           <w:rFonts w:cstheme="minorHAnsi"/>
+          <w:highlight w:val="yellow"/>
         </w:rPr>
         <w:t xml:space="preserve">principalmente por el mayor nivel de extracción reportado por las compañías mineras Yanacocha, </w:t>
       </w:r>
@@ -890,6 +1061,7 @@
       <w:r>
         <w:rPr>
           <w:rFonts w:cstheme="minorHAnsi"/>
+          <w:highlight w:val="yellow"/>
         </w:rPr>
         <w:t>Coimolache</w:t>
       </w:r>
@@ -897,12 +1069,14 @@
       <w:r>
         <w:rPr>
           <w:rFonts w:cstheme="minorHAnsi"/>
+          <w:highlight w:val="yellow"/>
         </w:rPr>
         <w:t xml:space="preserve">, Veta Dorada, Las Bambas, La Arena y Buenaventura. </w:t>
       </w:r>
       <w:r>
         <w:rPr>
           <w:rFonts w:ascii="Calibri" w:hAnsi="Calibri" w:cs="Calibri"/>
+          <w:highlight w:val="yellow"/>
         </w:rPr>
         <w:t xml:space="preserve">Asimismo, la producción de </w:t>
       </w:r>
@@ -912,6 +1086,7 @@
           <w:b/>
           <w:i/>
           <w:iCs/>
+          <w:highlight w:val="yellow"/>
         </w:rPr>
         <w:t>estaño</w:t>
       </w:r>
@@ -919,48 +1094,56 @@
         <w:rPr>
           <w:rFonts w:ascii="Calibri" w:hAnsi="Calibri" w:cs="Calibri"/>
           <w:b/>
+          <w:highlight w:val="yellow"/>
         </w:rPr>
         <w:t xml:space="preserve"> </w:t>
       </w:r>
       <w:r>
         <w:rPr>
           <w:rFonts w:ascii="Calibri" w:hAnsi="Calibri" w:cs="Calibri"/>
+          <w:highlight w:val="yellow"/>
         </w:rPr>
         <w:t>(</w:t>
       </w:r>
       <w:r>
         <w:rPr>
           <w:rFonts w:ascii="Calibri" w:hAnsi="Calibri" w:cs="Calibri"/>
+          <w:highlight w:val="yellow"/>
         </w:rPr>
         <w:t>0</w:t>
       </w:r>
       <w:r>
         <w:rPr>
           <w:rFonts w:ascii="Calibri" w:hAnsi="Calibri" w:cs="Calibri"/>
+          <w:highlight w:val="yellow"/>
         </w:rPr>
         <w:t>,</w:t>
       </w:r>
       <w:r>
         <w:rPr>
           <w:rFonts w:ascii="Calibri" w:hAnsi="Calibri" w:cs="Calibri"/>
+          <w:highlight w:val="yellow"/>
         </w:rPr>
         <w:t>51</w:t>
       </w:r>
       <w:r>
         <w:rPr>
           <w:rFonts w:ascii="Calibri" w:hAnsi="Calibri" w:cs="Calibri"/>
+          <w:highlight w:val="yellow"/>
         </w:rPr>
         <w:t xml:space="preserve">%) continuó </w:t>
       </w:r>
       <w:r>
         <w:rPr>
           <w:rFonts w:ascii="Calibri" w:hAnsi="Calibri" w:cs="Calibri"/>
+          <w:highlight w:val="yellow"/>
         </w:rPr>
         <w:t>su</w:t>
       </w:r>
       <w:r>
         <w:rPr>
           <w:rFonts w:ascii="Calibri" w:hAnsi="Calibri" w:cs="Calibri"/>
+          <w:highlight w:val="yellow"/>
         </w:rPr>
         <w:t xml:space="preserve"> expansión, como consecuencia del mayor nivel de procesamiento registrado por </w:t>
       </w:r>
@@ -968,6 +1151,7 @@
       <w:r>
         <w:rPr>
           <w:rFonts w:ascii="Calibri" w:hAnsi="Calibri" w:cs="Calibri"/>
+          <w:highlight w:val="yellow"/>
         </w:rPr>
         <w:t>Minsur</w:t>
       </w:r>
@@ -975,6 +1159,7 @@
       <w:r>
         <w:rPr>
           <w:rFonts w:ascii="Calibri" w:hAnsi="Calibri" w:cs="Calibri"/>
+          <w:highlight w:val="yellow"/>
         </w:rPr>
         <w:t>.</w:t>
       </w:r>
@@ -984,6 +1169,7 @@
         <w:jc w:val="both"/>
         <w:rPr>
           <w:rFonts w:ascii="Calibri" w:hAnsi="Calibri" w:cs="Calibri"/>
+          <w:highlight w:val="yellow"/>
         </w:rPr>
       </w:pPr>
     </w:p>
@@ -993,12 +1179,14 @@
         <w:rPr>
           <w:rFonts w:cstheme="minorHAnsi"/>
           <w:bCs/>
+          <w:highlight w:val="yellow"/>
         </w:rPr>
       </w:pPr>
       <w:r>
         <w:rPr>
           <w:rFonts w:cstheme="minorHAnsi"/>
           <w:bCs/>
+          <w:highlight w:val="yellow"/>
         </w:rPr>
         <w:lastRenderedPageBreak/>
         <w:t xml:space="preserve">En contraste, la producción de </w:t>
@@ -1009,6 +1197,7 @@
           <w:b/>
           <w:i/>
           <w:iCs/>
+          <w:highlight w:val="yellow"/>
         </w:rPr>
         <w:t>zinc</w:t>
       </w:r>
@@ -1016,6 +1205,7 @@
         <w:rPr>
           <w:rFonts w:cstheme="minorHAnsi"/>
           <w:bCs/>
+          <w:highlight w:val="yellow"/>
         </w:rPr>
         <w:t xml:space="preserve"> (-1,06%) registró una caída y revirtió la tendencia positiva observada desde marzo de 2025, debido a los menores volúmenes procesados principalmente en las compañías mineras Antamina, </w:t>
       </w:r>
@@ -1024,6 +1214,7 @@
         <w:rPr>
           <w:rFonts w:cstheme="minorHAnsi"/>
           <w:bCs/>
+          <w:highlight w:val="yellow"/>
         </w:rPr>
         <w:t>Volcan</w:t>
       </w:r>
@@ -1032,6 +1223,7 @@
         <w:rPr>
           <w:rFonts w:cstheme="minorHAnsi"/>
           <w:bCs/>
+          <w:highlight w:val="yellow"/>
         </w:rPr>
         <w:t xml:space="preserve">, Pan American Silver </w:t>
       </w:r>
@@ -1040,6 +1232,7 @@
         <w:rPr>
           <w:rFonts w:cstheme="minorHAnsi"/>
           <w:bCs/>
+          <w:highlight w:val="yellow"/>
         </w:rPr>
         <w:t>Huaron</w:t>
       </w:r>
@@ -1048,6 +1241,7 @@
         <w:rPr>
           <w:rFonts w:cstheme="minorHAnsi"/>
           <w:bCs/>
+          <w:highlight w:val="yellow"/>
         </w:rPr>
         <w:t xml:space="preserve">, </w:t>
       </w:r>
@@ -1056,6 +1250,7 @@
         <w:rPr>
           <w:rFonts w:cstheme="minorHAnsi"/>
           <w:bCs/>
+          <w:highlight w:val="yellow"/>
         </w:rPr>
         <w:t>Chungar</w:t>
       </w:r>
@@ -1064,6 +1259,7 @@
         <w:rPr>
           <w:rFonts w:cstheme="minorHAnsi"/>
           <w:bCs/>
+          <w:highlight w:val="yellow"/>
         </w:rPr>
         <w:t xml:space="preserve"> y Consorcio de Ingenieros Ejecutores.</w:t>
       </w:r>
@@ -1074,12 +1270,14 @@
         <w:rPr>
           <w:rFonts w:cstheme="minorHAnsi"/>
           <w:bCs/>
+          <w:highlight w:val="yellow"/>
         </w:rPr>
       </w:pPr>
       <w:r>
         <w:rPr>
           <w:rFonts w:cstheme="minorHAnsi"/>
           <w:bCs/>
+          <w:highlight w:val="yellow"/>
         </w:rPr>
         <w:t xml:space="preserve">Por su parte, la producción de </w:t>
       </w:r>
@@ -1089,6 +1287,7 @@
           <w:b/>
           <w:i/>
           <w:iCs/>
+          <w:highlight w:val="yellow"/>
         </w:rPr>
         <w:t>plomo</w:t>
       </w:r>
@@ -1096,6 +1295,7 @@
         <w:rPr>
           <w:rFonts w:cstheme="minorHAnsi"/>
           <w:bCs/>
+          <w:highlight w:val="yellow"/>
         </w:rPr>
         <w:t xml:space="preserve"> (-7,71%) registró una caída y revirtió la tendencia positiva que mantenía desde marzo de 2025, debido a los menores niveles reportados por las compañías mineras </w:t>
       </w:r>
@@ -1104,6 +1304,7 @@
         <w:rPr>
           <w:rFonts w:cstheme="minorHAnsi"/>
           <w:bCs/>
+          <w:highlight w:val="yellow"/>
         </w:rPr>
         <w:t>Volcan</w:t>
       </w:r>
@@ -1112,6 +1313,7 @@
         <w:rPr>
           <w:rFonts w:cstheme="minorHAnsi"/>
           <w:bCs/>
+          <w:highlight w:val="yellow"/>
         </w:rPr>
         <w:t xml:space="preserve"> y </w:t>
       </w:r>
@@ -1120,6 +1322,7 @@
         <w:rPr>
           <w:rFonts w:cstheme="minorHAnsi"/>
           <w:bCs/>
+          <w:highlight w:val="yellow"/>
         </w:rPr>
         <w:t>Chungar</w:t>
       </w:r>
@@ -1128,6 +1331,7 @@
         <w:rPr>
           <w:rFonts w:cstheme="minorHAnsi"/>
           <w:bCs/>
+          <w:highlight w:val="yellow"/>
         </w:rPr>
         <w:t>.</w:t>
       </w:r>
@@ -1137,11 +1341,13 @@
         <w:jc w:val="both"/>
         <w:rPr>
           <w:rFonts w:ascii="Calibri" w:hAnsi="Calibri" w:cs="Calibri"/>
+          <w:highlight w:val="yellow"/>
         </w:rPr>
       </w:pPr>
       <w:r>
         <w:rPr>
           <w:rFonts w:ascii="Calibri" w:hAnsi="Calibri" w:cs="Calibri"/>
+          <w:highlight w:val="yellow"/>
         </w:rPr>
         <w:t xml:space="preserve">De igual forma, la producción de </w:t>
       </w:r>
@@ -1152,12 +1358,14 @@
           <w:bCs/>
           <w:i/>
           <w:iCs/>
+          <w:highlight w:val="yellow"/>
         </w:rPr>
         <w:t>plata</w:t>
       </w:r>
       <w:r>
         <w:rPr>
           <w:rFonts w:ascii="Calibri" w:hAnsi="Calibri" w:cs="Calibri"/>
+          <w:highlight w:val="yellow"/>
         </w:rPr>
         <w:t xml:space="preserve"> (-2,65%) registró una caída luego del incremento observado el mes previo. Este resultado se sustentó en los menores volúmenes procesados por las compañías mineras </w:t>
       </w:r>
@@ -1165,6 +1373,7 @@
       <w:r>
         <w:rPr>
           <w:rFonts w:ascii="Calibri" w:hAnsi="Calibri" w:cs="Calibri"/>
+          <w:highlight w:val="yellow"/>
         </w:rPr>
         <w:t>Sobreandes</w:t>
       </w:r>
@@ -1172,6 +1381,7 @@
       <w:r>
         <w:rPr>
           <w:rFonts w:ascii="Calibri" w:hAnsi="Calibri" w:cs="Calibri"/>
+          <w:highlight w:val="yellow"/>
         </w:rPr>
         <w:t xml:space="preserve">, Buenaventura, </w:t>
       </w:r>
@@ -1179,6 +1389,7 @@
       <w:r>
         <w:rPr>
           <w:rFonts w:ascii="Calibri" w:hAnsi="Calibri" w:cs="Calibri"/>
+          <w:highlight w:val="yellow"/>
         </w:rPr>
         <w:t>Marcobre</w:t>
       </w:r>
@@ -1186,6 +1397,7 @@
       <w:r>
         <w:rPr>
           <w:rFonts w:ascii="Calibri" w:hAnsi="Calibri" w:cs="Calibri"/>
+          <w:highlight w:val="yellow"/>
         </w:rPr>
         <w:t xml:space="preserve">, Ares, Chinalco, Pan American Silver </w:t>
       </w:r>
@@ -1193,6 +1405,7 @@
       <w:r>
         <w:rPr>
           <w:rFonts w:ascii="Calibri" w:hAnsi="Calibri" w:cs="Calibri"/>
+          <w:highlight w:val="yellow"/>
         </w:rPr>
         <w:t>Huaron</w:t>
       </w:r>
@@ -1200,6 +1413,7 @@
       <w:r>
         <w:rPr>
           <w:rFonts w:ascii="Calibri" w:hAnsi="Calibri" w:cs="Calibri"/>
+          <w:highlight w:val="yellow"/>
         </w:rPr>
         <w:t xml:space="preserve">, </w:t>
       </w:r>
@@ -1207,6 +1421,7 @@
       <w:r>
         <w:rPr>
           <w:rFonts w:ascii="Calibri" w:hAnsi="Calibri" w:cs="Calibri"/>
+          <w:highlight w:val="yellow"/>
         </w:rPr>
         <w:t>Nexa</w:t>
       </w:r>
@@ -1214,6 +1429,7 @@
       <w:r>
         <w:rPr>
           <w:rFonts w:ascii="Calibri" w:hAnsi="Calibri" w:cs="Calibri"/>
+          <w:highlight w:val="yellow"/>
         </w:rPr>
         <w:t xml:space="preserve"> </w:t>
       </w:r>
@@ -1221,6 +1437,7 @@
       <w:r>
         <w:rPr>
           <w:rFonts w:ascii="Calibri" w:hAnsi="Calibri" w:cs="Calibri"/>
+          <w:highlight w:val="yellow"/>
         </w:rPr>
         <w:t>Resources</w:t>
       </w:r>
@@ -1228,6 +1445,7 @@
       <w:r>
         <w:rPr>
           <w:rFonts w:ascii="Calibri" w:hAnsi="Calibri" w:cs="Calibri"/>
+          <w:highlight w:val="yellow"/>
         </w:rPr>
         <w:t xml:space="preserve"> Cajamarquilla, </w:t>
       </w:r>
@@ -1235,6 +1453,7 @@
       <w:r>
         <w:rPr>
           <w:rFonts w:ascii="Calibri" w:hAnsi="Calibri" w:cs="Calibri"/>
+          <w:highlight w:val="yellow"/>
         </w:rPr>
         <w:t>Volcan</w:t>
       </w:r>
@@ -1242,6 +1461,7 @@
       <w:r>
         <w:rPr>
           <w:rFonts w:ascii="Calibri" w:hAnsi="Calibri" w:cs="Calibri"/>
+          <w:highlight w:val="yellow"/>
         </w:rPr>
         <w:t xml:space="preserve">, </w:t>
       </w:r>
@@ -1249,6 +1469,7 @@
       <w:r>
         <w:rPr>
           <w:rFonts w:ascii="Calibri" w:hAnsi="Calibri" w:cs="Calibri"/>
+          <w:highlight w:val="yellow"/>
         </w:rPr>
         <w:t>Chungar</w:t>
       </w:r>
@@ -1256,6 +1477,7 @@
       <w:r>
         <w:rPr>
           <w:rFonts w:ascii="Calibri" w:hAnsi="Calibri" w:cs="Calibri"/>
+          <w:highlight w:val="yellow"/>
         </w:rPr>
         <w:t xml:space="preserve">, </w:t>
       </w:r>
@@ -1263,6 +1485,7 @@
       <w:r>
         <w:rPr>
           <w:rFonts w:ascii="Calibri" w:hAnsi="Calibri" w:cs="Calibri"/>
+          <w:highlight w:val="yellow"/>
         </w:rPr>
         <w:t>Licuna</w:t>
       </w:r>
@@ -1270,6 +1493,7 @@
       <w:r>
         <w:rPr>
           <w:rFonts w:ascii="Calibri" w:hAnsi="Calibri" w:cs="Calibri"/>
+          <w:highlight w:val="yellow"/>
         </w:rPr>
         <w:t xml:space="preserve"> y </w:t>
       </w:r>
@@ -1277,6 +1501,7 @@
       <w:r>
         <w:rPr>
           <w:rFonts w:ascii="Calibri" w:hAnsi="Calibri" w:cs="Calibri"/>
+          <w:highlight w:val="yellow"/>
         </w:rPr>
         <w:t>Nexa</w:t>
       </w:r>
@@ -1284,6 +1509,7 @@
       <w:r>
         <w:rPr>
           <w:rFonts w:ascii="Calibri" w:hAnsi="Calibri" w:cs="Calibri"/>
+          <w:highlight w:val="yellow"/>
         </w:rPr>
         <w:t xml:space="preserve"> </w:t>
       </w:r>
@@ -1291,6 +1517,7 @@
       <w:r>
         <w:rPr>
           <w:rFonts w:ascii="Calibri" w:hAnsi="Calibri" w:cs="Calibri"/>
+          <w:highlight w:val="yellow"/>
         </w:rPr>
         <w:t>Resources</w:t>
       </w:r>
@@ -1298,6 +1525,7 @@
       <w:r>
         <w:rPr>
           <w:rFonts w:ascii="Calibri" w:hAnsi="Calibri" w:cs="Calibri"/>
+          <w:highlight w:val="yellow"/>
         </w:rPr>
         <w:t xml:space="preserve"> Perú, así como en la ausencia de producción de la minera Paraíso.</w:t>
       </w:r>
@@ -1312,6 +1540,7 @@
       <w:r>
         <w:rPr>
           <w:rFonts w:ascii="Calibri" w:hAnsi="Calibri" w:cs="Calibri"/>
+          <w:highlight w:val="yellow"/>
         </w:rPr>
         <w:t xml:space="preserve">La producción de </w:t>
       </w:r>
@@ -1322,36 +1551,42 @@
           <w:bCs/>
           <w:i/>
           <w:iCs/>
+          <w:highlight w:val="yellow"/>
         </w:rPr>
         <w:t>molibdeno</w:t>
       </w:r>
       <w:r>
         <w:rPr>
           <w:rFonts w:ascii="Calibri" w:hAnsi="Calibri" w:cs="Calibri"/>
+          <w:highlight w:val="yellow"/>
         </w:rPr>
         <w:t xml:space="preserve"> (-9,63%) volvió a </w:t>
       </w:r>
       <w:r>
         <w:rPr>
           <w:rFonts w:ascii="Calibri" w:hAnsi="Calibri" w:cs="Calibri"/>
+          <w:highlight w:val="yellow"/>
         </w:rPr>
         <w:t xml:space="preserve">registrar una caída, manteniendo </w:t>
       </w:r>
       <w:r>
         <w:rPr>
           <w:rFonts w:ascii="Calibri" w:hAnsi="Calibri" w:cs="Calibri"/>
+          <w:highlight w:val="yellow"/>
         </w:rPr>
         <w:t>la tendencia observada desde noviembre de 2025, debido principalmente a la reducción de los volúmenes procesados por</w:t>
       </w:r>
       <w:r>
         <w:rPr>
           <w:rFonts w:ascii="Calibri" w:hAnsi="Calibri" w:cs="Calibri"/>
+          <w:highlight w:val="yellow"/>
         </w:rPr>
         <w:t xml:space="preserve"> las compañías mineras</w:t>
       </w:r>
       <w:r>
         <w:rPr>
           <w:rFonts w:ascii="Calibri" w:hAnsi="Calibri" w:cs="Calibri"/>
+          <w:highlight w:val="yellow"/>
         </w:rPr>
         <w:t xml:space="preserve"> Antamina, Cerro Verde, </w:t>
       </w:r>
@@ -1359,6 +1594,7 @@
       <w:r>
         <w:rPr>
           <w:rFonts w:ascii="Calibri" w:hAnsi="Calibri" w:cs="Calibri"/>
+          <w:highlight w:val="yellow"/>
         </w:rPr>
         <w:t>Hudbay</w:t>
       </w:r>
@@ -1366,6 +1602,7 @@
       <w:r>
         <w:rPr>
           <w:rFonts w:ascii="Calibri" w:hAnsi="Calibri" w:cs="Calibri"/>
+          <w:highlight w:val="yellow"/>
         </w:rPr>
         <w:t xml:space="preserve"> Perú, Las Bambas y Chinalco Perú.</w:t>
       </w:r>
@@ -1394,6 +1631,7 @@
       <w:r>
         <w:rPr>
           <w:rFonts w:ascii="Calibri" w:hAnsi="Calibri" w:cs="Calibri"/>
+          <w:highlight w:val="yellow"/>
         </w:rPr>
         <w:t xml:space="preserve">El subsector de </w:t>
       </w:r>
@@ -1404,12 +1642,14 @@
           <w:bCs/>
           <w:i/>
           <w:iCs/>
+          <w:highlight w:val="yellow"/>
         </w:rPr>
         <w:t>hidrocarburos</w:t>
       </w:r>
       <w:r>
         <w:rPr>
           <w:rFonts w:ascii="Calibri" w:hAnsi="Calibri" w:cs="Calibri"/>
+          <w:highlight w:val="yellow"/>
         </w:rPr>
         <w:t xml:space="preserve"> registró una contracción de -9,73% en febrero de 2026, explicada por la menor extracción de petróleo crudo (-24,32%), líquidos de gas natural (-6,18%) y gas natural (-0,45%), que en conjunto aportaron una incidencia negativa de -1,22 puntos porcentuales.</w:t>
       </w:r>
@@ -1419,11 +1659,13 @@
         <w:jc w:val="both"/>
         <w:rPr>
           <w:rFonts w:cstheme="minorHAnsi"/>
+          <w:highlight w:val="red"/>
         </w:rPr>
       </w:pPr>
       <w:r>
         <w:rPr>
           <w:rFonts w:cstheme="minorHAnsi"/>
+          <w:highlight w:val="red"/>
         </w:rPr>
         <w:t xml:space="preserve">La evolución negativa del subsector de hidrocarburos en febrero de 2026 se explicó por la menor extracción de petróleo crudo, asociada a la reducción de la actividad en los principales lotes productores y a factores estructurales como la ausencia de perforación, menor actividad sísmica y menor inversión en 2025. Por su parte, la producción de gas natural y líquidos de gas natural se vio afectada por la menor actividad en los lotes de Camisea (88, 56 y 57), en un contexto internacional menos favorable, caracterizado por menores precios y demanda moderada. </w:t>
       </w:r>
@@ -1438,24 +1680,21 @@
       <w:r>
         <w:rPr>
           <w:rFonts w:cstheme="minorHAnsi"/>
+          <w:highlight w:val="red"/>
         </w:rPr>
         <w:t xml:space="preserve">Asimismo, las intensas precipitaciones pluviales en la zona sur generaron huaicos que bloquearon tramos de la Panamericana Sur, afectando el transporte de </w:t>
       </w:r>
       <w:r>
         <w:rPr>
           <w:rFonts w:cstheme="minorHAnsi"/>
-        </w:rPr>
-        <w:t xml:space="preserve">GNL </w:t>
-      </w:r>
-      <w:r>
-        <w:rPr>
-          <w:rFonts w:cstheme="minorHAnsi"/>
-        </w:rPr>
-        <w:t xml:space="preserve">(Gas Natural Licuado) </w:t>
-      </w:r>
-      <w:r>
-        <w:rPr>
-          <w:rFonts w:cstheme="minorHAnsi"/>
+          <w:highlight w:val="red"/>
+        </w:rPr>
+        <w:t xml:space="preserve">GNL (Gas Natural Licuado) </w:t>
+      </w:r>
+      <w:r>
+        <w:rPr>
+          <w:rFonts w:cstheme="minorHAnsi"/>
+          <w:highlight w:val="red"/>
         </w:rPr>
         <w:t>hacia Arequipa, Moquegua y Tacna. En este contexto, el Ministerio de Energía y Minas declaró en emergencia el suministro de gas natural en la concesión Sur Oeste, con vigencia desde el 22 de febrero de 2026, lo que implicó restricciones en el abastecimiento, principalmente a clientes industriales.</w:t>
       </w:r>
@@ -1465,11 +1704,13 @@
         <w:jc w:val="both"/>
         <w:rPr>
           <w:rFonts w:cstheme="minorHAnsi"/>
+          <w:highlight w:val="yellow"/>
         </w:rPr>
       </w:pPr>
       <w:r>
         <w:rPr>
           <w:rFonts w:cstheme="minorHAnsi"/>
+          <w:highlight w:val="yellow"/>
         </w:rPr>
         <w:t xml:space="preserve">La producción de </w:t>
       </w:r>
@@ -1480,6 +1721,7 @@
           <w:bCs/>
           <w:i/>
           <w:iCs/>
+          <w:highlight w:val="yellow"/>
         </w:rPr>
         <w:t>petróleo crudo</w:t>
       </w:r>
@@ -1488,12 +1730,14 @@
           <w:rFonts w:cstheme="minorHAnsi"/>
           <w:i/>
           <w:iCs/>
+          <w:highlight w:val="yellow"/>
         </w:rPr>
         <w:t xml:space="preserve"> </w:t>
       </w:r>
       <w:r>
         <w:rPr>
           <w:rFonts w:cstheme="minorHAnsi"/>
+          <w:highlight w:val="yellow"/>
         </w:rPr>
         <w:t>(-24,32%) volvió a registrar una caída,</w:t>
       </w:r>
@@ -1501,12 +1745,14 @@
         <w:rPr>
           <w:rFonts w:cstheme="minorHAnsi"/>
           <w:iCs/>
+          <w:highlight w:val="yellow"/>
         </w:rPr>
         <w:t xml:space="preserve"> explicada por</w:t>
       </w:r>
       <w:r>
         <w:rPr>
           <w:rFonts w:cstheme="minorHAnsi"/>
+          <w:highlight w:val="yellow"/>
         </w:rPr>
         <w:t xml:space="preserve"> el menor volumen de explotación reportado por </w:t>
       </w:r>
@@ -1514,6 +1760,7 @@
       <w:r>
         <w:rPr>
           <w:rFonts w:cstheme="minorHAnsi"/>
+          <w:highlight w:val="yellow"/>
         </w:rPr>
         <w:t>Petrotal</w:t>
       </w:r>
@@ -1521,18 +1768,21 @@
       <w:r>
         <w:rPr>
           <w:rFonts w:cstheme="minorHAnsi"/>
+          <w:highlight w:val="yellow"/>
         </w:rPr>
         <w:t xml:space="preserve"> Perú (lote 95), Petroperú (lote Z-69), OIG </w:t>
       </w:r>
       <w:r>
         <w:rPr>
           <w:rFonts w:cstheme="minorHAnsi"/>
+          <w:highlight w:val="yellow"/>
         </w:rPr>
         <w:t xml:space="preserve">Perú </w:t>
       </w:r>
       <w:r>
         <w:rPr>
           <w:rFonts w:cstheme="minorHAnsi"/>
+          <w:highlight w:val="yellow"/>
         </w:rPr>
         <w:t xml:space="preserve">(lote X), UNNA Energía (lotes III y IV), </w:t>
       </w:r>
@@ -1540,6 +1790,7 @@
       <w:r>
         <w:rPr>
           <w:rFonts w:cstheme="minorHAnsi"/>
+          <w:highlight w:val="yellow"/>
         </w:rPr>
         <w:t>Ucawa</w:t>
       </w:r>
@@ -1547,12 +1798,14 @@
       <w:r>
         <w:rPr>
           <w:rFonts w:cstheme="minorHAnsi"/>
+          <w:highlight w:val="yellow"/>
         </w:rPr>
         <w:t xml:space="preserve"> Energy</w:t>
       </w:r>
       <w:r>
         <w:rPr>
           <w:rFonts w:cstheme="minorHAnsi"/>
+          <w:highlight w:val="yellow"/>
         </w:rPr>
         <w:t xml:space="preserve"> (lote 131), </w:t>
       </w:r>
@@ -1560,6 +1813,7 @@
       <w:r>
         <w:rPr>
           <w:rFonts w:cstheme="minorHAnsi"/>
+          <w:highlight w:val="yellow"/>
         </w:rPr>
         <w:t>Olympic</w:t>
       </w:r>
@@ -1567,24 +1821,28 @@
       <w:r>
         <w:rPr>
           <w:rFonts w:cstheme="minorHAnsi"/>
+          <w:highlight w:val="yellow"/>
         </w:rPr>
         <w:t xml:space="preserve"> (lote XIII</w:t>
       </w:r>
       <w:r>
         <w:rPr>
           <w:rFonts w:cstheme="minorHAnsi"/>
+          <w:highlight w:val="yellow"/>
         </w:rPr>
         <w:t xml:space="preserve">) y Corporación del Sur (lote V), así como por la inactividad </w:t>
       </w:r>
       <w:r>
         <w:rPr>
           <w:rFonts w:cstheme="minorHAnsi"/>
+          <w:highlight w:val="yellow"/>
         </w:rPr>
         <w:t>en los lotes II, VI, XV y XX</w:t>
       </w:r>
       <w:r>
         <w:rPr>
           <w:rFonts w:cstheme="minorHAnsi"/>
+          <w:highlight w:val="yellow"/>
         </w:rPr>
         <w:t>.</w:t>
       </w:r>
@@ -1594,17 +1852,20 @@
         <w:jc w:val="both"/>
         <w:rPr>
           <w:rFonts w:cstheme="minorHAnsi"/>
+          <w:highlight w:val="yellow"/>
         </w:rPr>
       </w:pPr>
       <w:r>
         <w:rPr>
           <w:rFonts w:cstheme="minorHAnsi"/>
+          <w:highlight w:val="yellow"/>
         </w:rPr>
         <w:t>Por su parte, l</w:t>
       </w:r>
       <w:r>
         <w:rPr>
           <w:rFonts w:cstheme="minorHAnsi"/>
+          <w:highlight w:val="yellow"/>
         </w:rPr>
         <w:t xml:space="preserve">a producción de </w:t>
       </w:r>
@@ -1615,120 +1876,140 @@
           <w:bCs/>
           <w:i/>
           <w:iCs/>
+          <w:highlight w:val="yellow"/>
         </w:rPr>
         <w:t>líquidos de gas natural</w:t>
       </w:r>
       <w:r>
         <w:rPr>
           <w:rFonts w:cstheme="minorHAnsi"/>
+          <w:highlight w:val="yellow"/>
         </w:rPr>
         <w:t xml:space="preserve"> (</w:t>
       </w:r>
       <w:r>
         <w:rPr>
           <w:rFonts w:cstheme="minorHAnsi"/>
+          <w:highlight w:val="yellow"/>
         </w:rPr>
         <w:t>-6</w:t>
       </w:r>
       <w:r>
         <w:rPr>
           <w:rFonts w:cstheme="minorHAnsi"/>
+          <w:highlight w:val="yellow"/>
         </w:rPr>
         <w:t>,</w:t>
       </w:r>
       <w:r>
         <w:rPr>
           <w:rFonts w:cstheme="minorHAnsi"/>
+          <w:highlight w:val="yellow"/>
         </w:rPr>
         <w:t>18</w:t>
       </w:r>
       <w:r>
         <w:rPr>
           <w:rFonts w:cstheme="minorHAnsi"/>
+          <w:highlight w:val="yellow"/>
         </w:rPr>
         <w:t xml:space="preserve">%) </w:t>
       </w:r>
       <w:r>
         <w:rPr>
           <w:rFonts w:cstheme="minorHAnsi"/>
+          <w:highlight w:val="yellow"/>
         </w:rPr>
         <w:t xml:space="preserve">mostro un retroceso luego del incremento observado </w:t>
       </w:r>
       <w:r>
         <w:rPr>
           <w:rFonts w:cstheme="minorHAnsi"/>
+          <w:highlight w:val="yellow"/>
         </w:rPr>
         <w:t xml:space="preserve">en </w:t>
       </w:r>
       <w:r>
         <w:rPr>
           <w:rFonts w:cstheme="minorHAnsi"/>
+          <w:highlight w:val="yellow"/>
         </w:rPr>
         <w:t>enero</w:t>
       </w:r>
       <w:r>
         <w:rPr>
           <w:rFonts w:cstheme="minorHAnsi"/>
+          <w:highlight w:val="yellow"/>
         </w:rPr>
         <w:t xml:space="preserve">, como consecuencia del </w:t>
       </w:r>
       <w:r>
         <w:rPr>
           <w:rFonts w:cstheme="minorHAnsi"/>
+          <w:highlight w:val="yellow"/>
         </w:rPr>
         <w:t>menor</w:t>
       </w:r>
       <w:r>
         <w:rPr>
           <w:rFonts w:cstheme="minorHAnsi"/>
+          <w:highlight w:val="yellow"/>
         </w:rPr>
         <w:t xml:space="preserve"> nivel de explotación en</w:t>
       </w:r>
       <w:r>
         <w:rPr>
           <w:rFonts w:cstheme="minorHAnsi"/>
+          <w:highlight w:val="yellow"/>
         </w:rPr>
         <w:t xml:space="preserve"> </w:t>
       </w:r>
       <w:r>
         <w:rPr>
           <w:rFonts w:cstheme="minorHAnsi"/>
+          <w:highlight w:val="yellow"/>
         </w:rPr>
         <w:t xml:space="preserve">los </w:t>
       </w:r>
       <w:r>
         <w:rPr>
           <w:rFonts w:cstheme="minorHAnsi"/>
+          <w:highlight w:val="yellow"/>
         </w:rPr>
         <w:t>lote</w:t>
       </w:r>
       <w:r>
         <w:rPr>
           <w:rFonts w:cstheme="minorHAnsi"/>
+          <w:highlight w:val="yellow"/>
         </w:rPr>
         <w:t>s</w:t>
       </w:r>
       <w:r>
         <w:rPr>
           <w:rFonts w:cstheme="minorHAnsi"/>
+          <w:highlight w:val="yellow"/>
         </w:rPr>
         <w:t xml:space="preserve"> 88</w:t>
       </w:r>
       <w:r>
         <w:rPr>
           <w:rFonts w:cstheme="minorHAnsi"/>
+          <w:highlight w:val="yellow"/>
         </w:rPr>
         <w:t xml:space="preserve"> </w:t>
       </w:r>
       <w:r>
         <w:rPr>
           <w:rFonts w:cstheme="minorHAnsi"/>
+          <w:highlight w:val="yellow"/>
         </w:rPr>
         <w:t>(</w:t>
       </w:r>
       <w:r>
         <w:rPr>
           <w:rFonts w:cstheme="minorHAnsi"/>
+          <w:highlight w:val="yellow"/>
         </w:rPr>
         <w:t xml:space="preserve">Pluspetrol </w:t>
       </w:r>
@@ -1736,12 +2017,14 @@
       <w:r>
         <w:rPr>
           <w:rFonts w:cstheme="minorHAnsi"/>
+          <w:highlight w:val="yellow"/>
         </w:rPr>
         <w:t>Per</w:t>
       </w:r>
       <w:r>
         <w:rPr>
           <w:rFonts w:cstheme="minorHAnsi"/>
+          <w:highlight w:val="yellow"/>
         </w:rPr>
         <w:t>u</w:t>
       </w:r>
@@ -1749,6 +2032,7 @@
       <w:r>
         <w:rPr>
           <w:rFonts w:cstheme="minorHAnsi"/>
+          <w:highlight w:val="yellow"/>
         </w:rPr>
         <w:t xml:space="preserve"> </w:t>
       </w:r>
@@ -1756,6 +2040,7 @@
       <w:r>
         <w:rPr>
           <w:rFonts w:cstheme="minorHAnsi"/>
+          <w:highlight w:val="yellow"/>
         </w:rPr>
         <w:t>Corporation</w:t>
       </w:r>
@@ -1763,90 +2048,105 @@
       <w:r>
         <w:rPr>
           <w:rFonts w:cstheme="minorHAnsi"/>
+          <w:highlight w:val="yellow"/>
         </w:rPr>
         <w:t>)</w:t>
       </w:r>
       <w:r>
         <w:rPr>
           <w:rFonts w:cstheme="minorHAnsi"/>
+          <w:highlight w:val="yellow"/>
         </w:rPr>
         <w:t>,</w:t>
       </w:r>
       <w:r>
         <w:rPr>
           <w:rFonts w:cstheme="minorHAnsi"/>
+          <w:highlight w:val="yellow"/>
         </w:rPr>
         <w:t xml:space="preserve"> 57 </w:t>
       </w:r>
       <w:r>
         <w:rPr>
           <w:rFonts w:cstheme="minorHAnsi"/>
+          <w:highlight w:val="yellow"/>
         </w:rPr>
         <w:t>(</w:t>
       </w:r>
       <w:r>
         <w:rPr>
           <w:rFonts w:cstheme="minorHAnsi"/>
+          <w:highlight w:val="yellow"/>
         </w:rPr>
         <w:t>Repsol</w:t>
       </w:r>
       <w:r>
         <w:rPr>
           <w:rFonts w:cstheme="minorHAnsi"/>
+          <w:highlight w:val="yellow"/>
         </w:rPr>
         <w:t xml:space="preserve">) y </w:t>
       </w:r>
       <w:r>
         <w:rPr>
           <w:rFonts w:cstheme="minorHAnsi"/>
+          <w:highlight w:val="yellow"/>
         </w:rPr>
         <w:t xml:space="preserve">Z-69 </w:t>
       </w:r>
       <w:r>
         <w:rPr>
           <w:rFonts w:cstheme="minorHAnsi"/>
+          <w:highlight w:val="yellow"/>
         </w:rPr>
         <w:t>(</w:t>
       </w:r>
       <w:r>
         <w:rPr>
           <w:rFonts w:cstheme="minorHAnsi"/>
+          <w:highlight w:val="yellow"/>
         </w:rPr>
         <w:t>Petroper</w:t>
       </w:r>
       <w:r>
         <w:rPr>
           <w:rFonts w:cstheme="minorHAnsi"/>
+          <w:highlight w:val="yellow"/>
         </w:rPr>
         <w:t>ú</w:t>
       </w:r>
       <w:r>
         <w:rPr>
           <w:rFonts w:cstheme="minorHAnsi"/>
+          <w:highlight w:val="yellow"/>
         </w:rPr>
         <w:t>), además de</w:t>
       </w:r>
       <w:r>
         <w:rPr>
           <w:rFonts w:cstheme="minorHAnsi"/>
+          <w:highlight w:val="yellow"/>
         </w:rPr>
         <w:t xml:space="preserve"> la inactividad en el lote 31</w:t>
       </w:r>
       <w:r>
         <w:rPr>
           <w:rFonts w:cstheme="minorHAnsi"/>
+          <w:highlight w:val="yellow"/>
         </w:rPr>
         <w:t>-</w:t>
       </w:r>
       <w:r>
         <w:rPr>
           <w:rFonts w:cstheme="minorHAnsi"/>
+          <w:highlight w:val="yellow"/>
         </w:rPr>
         <w:t>C</w:t>
       </w:r>
       <w:r>
         <w:rPr>
           <w:rFonts w:cstheme="minorHAnsi"/>
+          <w:highlight w:val="yellow"/>
         </w:rPr>
         <w:t xml:space="preserve"> (</w:t>
       </w:r>
@@ -1854,6 +2154,7 @@
       <w:r>
         <w:rPr>
           <w:rFonts w:cstheme="minorHAnsi"/>
+          <w:highlight w:val="yellow"/>
         </w:rPr>
         <w:t>Aguaytia</w:t>
       </w:r>
@@ -1861,18 +2162,21 @@
       <w:r>
         <w:rPr>
           <w:rFonts w:cstheme="minorHAnsi"/>
+          <w:highlight w:val="yellow"/>
         </w:rPr>
         <w:t xml:space="preserve"> Energy</w:t>
       </w:r>
       <w:r>
         <w:rPr>
           <w:rFonts w:cstheme="minorHAnsi"/>
+          <w:highlight w:val="yellow"/>
         </w:rPr>
         <w:t>)</w:t>
       </w:r>
       <w:r>
         <w:rPr>
           <w:rFonts w:cstheme="minorHAnsi"/>
+          <w:highlight w:val="yellow"/>
         </w:rPr>
         <w:t>.</w:t>
       </w:r>
@@ -1888,6 +2192,7 @@
       <w:r>
         <w:rPr>
           <w:rFonts w:cstheme="minorHAnsi"/>
+          <w:highlight w:val="yellow"/>
         </w:rPr>
         <w:lastRenderedPageBreak/>
         <w:t>De la misma manera</w:t>
@@ -1895,12 +2200,14 @@
       <w:r>
         <w:rPr>
           <w:rFonts w:cstheme="minorHAnsi"/>
+          <w:highlight w:val="yellow"/>
         </w:rPr>
         <w:t>, l</w:t>
       </w:r>
       <w:r>
         <w:rPr>
           <w:rFonts w:cstheme="minorHAnsi"/>
+          <w:highlight w:val="yellow"/>
         </w:rPr>
         <w:t xml:space="preserve">a producción de </w:t>
       </w:r>
@@ -1911,6 +2218,7 @@
           <w:bCs/>
           <w:i/>
           <w:iCs/>
+          <w:highlight w:val="yellow"/>
         </w:rPr>
         <w:t>gas natural</w:t>
       </w:r>
@@ -1919,54 +2227,63 @@
           <w:rFonts w:cstheme="minorHAnsi"/>
           <w:i/>
           <w:iCs/>
+          <w:highlight w:val="yellow"/>
         </w:rPr>
         <w:t xml:space="preserve"> </w:t>
       </w:r>
       <w:r>
         <w:rPr>
           <w:rFonts w:cstheme="minorHAnsi"/>
+          <w:highlight w:val="yellow"/>
         </w:rPr>
         <w:t>(</w:t>
       </w:r>
       <w:r>
         <w:rPr>
           <w:rFonts w:cstheme="minorHAnsi"/>
+          <w:highlight w:val="yellow"/>
         </w:rPr>
         <w:t>-0</w:t>
       </w:r>
       <w:r>
         <w:rPr>
           <w:rFonts w:cstheme="minorHAnsi"/>
+          <w:highlight w:val="yellow"/>
         </w:rPr>
         <w:t>,</w:t>
       </w:r>
       <w:r>
         <w:rPr>
           <w:rFonts w:cstheme="minorHAnsi"/>
+          <w:highlight w:val="yellow"/>
         </w:rPr>
         <w:t>45</w:t>
       </w:r>
       <w:r>
         <w:rPr>
           <w:rFonts w:cstheme="minorHAnsi"/>
+          <w:highlight w:val="yellow"/>
         </w:rPr>
         <w:t xml:space="preserve">%) </w:t>
       </w:r>
       <w:r>
         <w:rPr>
           <w:rFonts w:cstheme="minorHAnsi"/>
+          <w:highlight w:val="yellow"/>
         </w:rPr>
         <w:t>registró una ligera contracción en febrero de 2026, asociada a menores volúmenes de extracción en los lotes 57 (Repsol), X (OIG</w:t>
       </w:r>
       <w:r>
         <w:rPr>
           <w:rFonts w:cstheme="minorHAnsi"/>
+          <w:highlight w:val="yellow"/>
         </w:rPr>
         <w:t xml:space="preserve"> Perú</w:t>
       </w:r>
       <w:r>
         <w:rPr>
           <w:rFonts w:cstheme="minorHAnsi"/>
+          <w:highlight w:val="yellow"/>
         </w:rPr>
         <w:t xml:space="preserve">) y 56 (Pluspetrol </w:t>
       </w:r>
@@ -1974,12 +2291,14 @@
       <w:r>
         <w:rPr>
           <w:rFonts w:cstheme="minorHAnsi"/>
+          <w:highlight w:val="yellow"/>
         </w:rPr>
         <w:t>Per</w:t>
       </w:r>
       <w:r>
         <w:rPr>
           <w:rFonts w:cstheme="minorHAnsi"/>
+          <w:highlight w:val="yellow"/>
         </w:rPr>
         <w:t>u</w:t>
       </w:r>
@@ -1987,6 +2306,7 @@
       <w:r>
         <w:rPr>
           <w:rFonts w:cstheme="minorHAnsi"/>
+          <w:highlight w:val="yellow"/>
         </w:rPr>
         <w:t xml:space="preserve"> </w:t>
       </w:r>
@@ -1994,6 +2314,7 @@
       <w:r>
         <w:rPr>
           <w:rFonts w:cstheme="minorHAnsi"/>
+          <w:highlight w:val="yellow"/>
         </w:rPr>
         <w:t>Corporation</w:t>
       </w:r>
@@ -2001,48 +2322,56 @@
       <w:r>
         <w:rPr>
           <w:rFonts w:cstheme="minorHAnsi"/>
+          <w:highlight w:val="yellow"/>
         </w:rPr>
         <w:t>), así como</w:t>
       </w:r>
       <w:r>
         <w:rPr>
           <w:rFonts w:cstheme="minorHAnsi"/>
+          <w:highlight w:val="yellow"/>
         </w:rPr>
         <w:t xml:space="preserve"> por</w:t>
       </w:r>
       <w:r>
         <w:rPr>
           <w:rFonts w:cstheme="minorHAnsi"/>
+          <w:highlight w:val="yellow"/>
         </w:rPr>
         <w:t xml:space="preserve"> la inactividad </w:t>
       </w:r>
       <w:r>
         <w:rPr>
           <w:rFonts w:cstheme="minorHAnsi"/>
+          <w:highlight w:val="yellow"/>
         </w:rPr>
         <w:t xml:space="preserve">en </w:t>
       </w:r>
       <w:r>
         <w:rPr>
           <w:rFonts w:cstheme="minorHAnsi"/>
+          <w:highlight w:val="yellow"/>
         </w:rPr>
         <w:t>los lotes I</w:t>
       </w:r>
       <w:r>
         <w:rPr>
           <w:rFonts w:cstheme="minorHAnsi"/>
+          <w:highlight w:val="yellow"/>
         </w:rPr>
         <w:t>I</w:t>
       </w:r>
       <w:r>
         <w:rPr>
           <w:rFonts w:cstheme="minorHAnsi"/>
+          <w:highlight w:val="yellow"/>
         </w:rPr>
         <w:t xml:space="preserve"> y VI</w:t>
       </w:r>
       <w:r>
         <w:rPr>
           <w:rFonts w:cstheme="minorHAnsi"/>
+          <w:highlight w:val="yellow"/>
         </w:rPr>
         <w:t>.</w:t>
       </w:r>
@@ -2082,6 +2411,7 @@
           <w:i w:val="0"/>
           <w:sz w:val="22"/>
           <w:szCs w:val="22"/>
+          <w:highlight w:val="yellow"/>
           <w:lang w:val="es-ES"/>
         </w:rPr>
       </w:pPr>
@@ -2091,6 +2421,7 @@
           <w:i w:val="0"/>
           <w:sz w:val="22"/>
           <w:szCs w:val="22"/>
+          <w:highlight w:val="yellow"/>
           <w:lang w:val="es-ES"/>
         </w:rPr>
         <w:t xml:space="preserve">El sector minería e hidrocarburos, en el periodo enero – febrero de 2026, registró un crecimiento de </w:t>
@@ -2101,6 +2432,7 @@
           <w:i w:val="0"/>
           <w:sz w:val="22"/>
           <w:szCs w:val="22"/>
+          <w:highlight w:val="yellow"/>
           <w:lang w:val="es-ES"/>
         </w:rPr>
         <w:t>0,97</w:t>
@@ -2111,6 +2443,7 @@
           <w:i w:val="0"/>
           <w:sz w:val="22"/>
           <w:szCs w:val="22"/>
+          <w:highlight w:val="yellow"/>
           <w:lang w:val="es-ES"/>
         </w:rPr>
         <w:t xml:space="preserve">%, explicado por el desempeño positivo de la actividad minera metálica en </w:t>
@@ -2121,6 +2454,7 @@
           <w:i w:val="0"/>
           <w:sz w:val="22"/>
           <w:szCs w:val="22"/>
+          <w:highlight w:val="yellow"/>
           <w:lang w:val="es-ES"/>
         </w:rPr>
         <w:t>1</w:t>
@@ -2131,6 +2465,7 @@
           <w:i w:val="0"/>
           <w:sz w:val="22"/>
           <w:szCs w:val="22"/>
+          <w:highlight w:val="yellow"/>
           <w:lang w:val="es-ES"/>
         </w:rPr>
         <w:t>,</w:t>
@@ -2141,6 +2476,7 @@
           <w:i w:val="0"/>
           <w:sz w:val="22"/>
           <w:szCs w:val="22"/>
+          <w:highlight w:val="yellow"/>
           <w:lang w:val="es-ES"/>
         </w:rPr>
         <w:t>71</w:t>
@@ -2151,6 +2487,7 @@
           <w:i w:val="0"/>
           <w:sz w:val="22"/>
           <w:szCs w:val="22"/>
+          <w:highlight w:val="yellow"/>
           <w:lang w:val="es-ES"/>
         </w:rPr>
         <w:t xml:space="preserve">%, sustentado en los mayores volúmenes de producción de </w:t>
@@ -2161,6 +2498,7 @@
           <w:i w:val="0"/>
           <w:sz w:val="22"/>
           <w:szCs w:val="22"/>
+          <w:highlight w:val="yellow"/>
           <w:lang w:val="es-ES"/>
         </w:rPr>
         <w:t>cobre en 2,62%, zinc 6,13%</w:t>
@@ -2171,6 +2509,7 @@
           <w:i w:val="0"/>
           <w:sz w:val="22"/>
           <w:szCs w:val="22"/>
+          <w:highlight w:val="yellow"/>
           <w:lang w:val="es-ES"/>
         </w:rPr>
         <w:t xml:space="preserve"> y</w:t>
@@ -2181,6 +2520,7 @@
           <w:i w:val="0"/>
           <w:sz w:val="22"/>
           <w:szCs w:val="22"/>
+          <w:highlight w:val="yellow"/>
           <w:lang w:val="es-ES"/>
         </w:rPr>
         <w:t xml:space="preserve"> oro 2,16%</w:t>
@@ -2191,6 +2531,7 @@
           <w:i w:val="0"/>
           <w:sz w:val="22"/>
           <w:szCs w:val="22"/>
+          <w:highlight w:val="yellow"/>
           <w:lang w:val="es-ES"/>
         </w:rPr>
         <w:t>, con un aporte conjunto de 2,</w:t>
@@ -2201,6 +2542,7 @@
           <w:i w:val="0"/>
           <w:sz w:val="22"/>
           <w:szCs w:val="22"/>
+          <w:highlight w:val="yellow"/>
           <w:lang w:val="es-ES"/>
         </w:rPr>
         <w:t>04</w:t>
@@ -2211,6 +2553,7 @@
           <w:i w:val="0"/>
           <w:sz w:val="22"/>
           <w:szCs w:val="22"/>
+          <w:highlight w:val="yellow"/>
           <w:lang w:val="es-ES"/>
         </w:rPr>
         <w:t xml:space="preserve"> puntos porcentuales al resultado global del sector, coadyuvado por los incrementos en la producción acumulada de </w:t>
@@ -2221,6 +2564,7 @@
           <w:i w:val="0"/>
           <w:sz w:val="22"/>
           <w:szCs w:val="22"/>
+          <w:highlight w:val="yellow"/>
           <w:lang w:val="es-ES"/>
         </w:rPr>
         <w:t>hierro en 1,35%, plata 0,77% y estaño 2,22%</w:t>
@@ -2231,6 +2575,7 @@
           <w:i w:val="0"/>
           <w:sz w:val="22"/>
           <w:szCs w:val="22"/>
+          <w:highlight w:val="yellow"/>
           <w:lang w:val="es-ES"/>
         </w:rPr>
         <w:t>, con una contribución total de 0,</w:t>
@@ -2241,6 +2586,7 @@
           <w:i w:val="0"/>
           <w:sz w:val="22"/>
           <w:szCs w:val="22"/>
+          <w:highlight w:val="yellow"/>
           <w:lang w:val="es-ES"/>
         </w:rPr>
         <w:t>09</w:t>
@@ -2251,6 +2597,7 @@
           <w:i w:val="0"/>
           <w:sz w:val="22"/>
           <w:szCs w:val="22"/>
+          <w:highlight w:val="yellow"/>
           <w:lang w:val="es-ES"/>
         </w:rPr>
         <w:t xml:space="preserve"> puntos porcentuales; atenuada por la variación acumulada negativa en la producción de </w:t>
@@ -2261,6 +2608,7 @@
           <w:i w:val="0"/>
           <w:sz w:val="22"/>
           <w:szCs w:val="22"/>
+          <w:highlight w:val="yellow"/>
           <w:lang w:val="es-ES"/>
         </w:rPr>
         <w:t xml:space="preserve">plomo (-2,87%) y </w:t>
@@ -2271,6 +2619,7 @@
           <w:i w:val="0"/>
           <w:sz w:val="22"/>
           <w:szCs w:val="22"/>
+          <w:highlight w:val="yellow"/>
           <w:lang w:val="es-ES"/>
         </w:rPr>
         <w:t>molibdeno (-</w:t>
@@ -2281,6 +2630,7 @@
           <w:i w:val="0"/>
           <w:sz w:val="22"/>
           <w:szCs w:val="22"/>
+          <w:highlight w:val="yellow"/>
           <w:lang w:val="es-ES"/>
         </w:rPr>
         <w:t>6</w:t>
@@ -2291,6 +2641,7 @@
           <w:i w:val="0"/>
           <w:sz w:val="22"/>
           <w:szCs w:val="22"/>
+          <w:highlight w:val="yellow"/>
           <w:lang w:val="es-ES"/>
         </w:rPr>
         <w:t>,</w:t>
@@ -2301,6 +2652,7 @@
           <w:i w:val="0"/>
           <w:sz w:val="22"/>
           <w:szCs w:val="22"/>
+          <w:highlight w:val="yellow"/>
           <w:lang w:val="es-ES"/>
         </w:rPr>
         <w:t>94</w:t>
@@ -2311,6 +2663,7 @@
           <w:i w:val="0"/>
           <w:sz w:val="22"/>
           <w:szCs w:val="22"/>
+          <w:highlight w:val="yellow"/>
           <w:lang w:val="es-ES"/>
         </w:rPr>
         <w:t xml:space="preserve">%), ambos productos con una incidencia negativa de </w:t>
@@ -2321,6 +2674,7 @@
           <w:i w:val="0"/>
           <w:sz w:val="22"/>
           <w:szCs w:val="22"/>
+          <w:highlight w:val="yellow"/>
           <w:lang w:val="es-ES"/>
         </w:rPr>
         <w:t>0</w:t>
@@ -2331,6 +2685,7 @@
           <w:i w:val="0"/>
           <w:sz w:val="22"/>
           <w:szCs w:val="22"/>
+          <w:highlight w:val="yellow"/>
           <w:lang w:val="es-ES"/>
         </w:rPr>
         <w:t>,</w:t>
@@ -2341,6 +2696,7 @@
           <w:i w:val="0"/>
           <w:sz w:val="22"/>
           <w:szCs w:val="22"/>
+          <w:highlight w:val="yellow"/>
           <w:lang w:val="es-ES"/>
         </w:rPr>
         <w:t>64</w:t>
@@ -2351,6 +2707,7 @@
           <w:i w:val="0"/>
           <w:sz w:val="22"/>
           <w:szCs w:val="22"/>
+          <w:highlight w:val="yellow"/>
           <w:lang w:val="es-ES"/>
         </w:rPr>
         <w:t xml:space="preserve"> puntos porcentuales.</w:t>
@@ -2375,6 +2732,7 @@
           <w:i w:val="0"/>
           <w:sz w:val="22"/>
           <w:szCs w:val="22"/>
+          <w:highlight w:val="yellow"/>
           <w:lang w:val="es-ES"/>
         </w:rPr>
         <w:t xml:space="preserve">Por otro lado, el subsector hidrocarburos presentó una disminución de 4,13% en el periodo de referencia, explicada principalmente por el menor volumen de explotación de petróleo crudo (-21,24%), con una incidencia negativa de </w:t>
@@ -2385,6 +2743,7 @@
           <w:i w:val="0"/>
           <w:sz w:val="22"/>
           <w:szCs w:val="22"/>
+          <w:highlight w:val="yellow"/>
           <w:lang w:val="es-ES"/>
         </w:rPr>
         <w:t>0</w:t>
@@ -2395,6 +2754,7 @@
           <w:i w:val="0"/>
           <w:sz w:val="22"/>
           <w:szCs w:val="22"/>
+          <w:highlight w:val="yellow"/>
           <w:lang w:val="es-ES"/>
         </w:rPr>
         <w:t>,</w:t>
@@ -2405,6 +2765,7 @@
           <w:i w:val="0"/>
           <w:sz w:val="22"/>
           <w:szCs w:val="22"/>
+          <w:highlight w:val="yellow"/>
           <w:lang w:val="es-ES"/>
         </w:rPr>
         <w:t>82</w:t>
@@ -2415,6 +2776,7 @@
           <w:i w:val="0"/>
           <w:sz w:val="22"/>
           <w:szCs w:val="22"/>
+          <w:highlight w:val="yellow"/>
           <w:lang w:val="es-ES"/>
         </w:rPr>
         <w:t xml:space="preserve"> puntos porcentuales a la evolución del sector; en contraste, la producción de líquidos de gas natural (1,45%) y de gas natural (6,15%) registraron incrementos, con una incidencia positiva conjunta de </w:t>
@@ -2425,6 +2787,7 @@
           <w:i w:val="0"/>
           <w:sz w:val="22"/>
           <w:szCs w:val="22"/>
+          <w:highlight w:val="yellow"/>
           <w:lang w:val="es-ES"/>
         </w:rPr>
         <w:t>0,29</w:t>
@@ -2435,6 +2798,7 @@
           <w:i w:val="0"/>
           <w:sz w:val="22"/>
           <w:szCs w:val="22"/>
+          <w:highlight w:val="yellow"/>
           <w:lang w:val="es-ES"/>
         </w:rPr>
         <w:t xml:space="preserve"> puntos porcentuales, atenuando parcialmente la caída del subsector.</w:t>
@@ -2450,6 +2814,7 @@
           <w:i w:val="0"/>
           <w:sz w:val="22"/>
           <w:szCs w:val="22"/>
+          <w:highlight w:val="yellow"/>
           <w:lang w:val="es-ES"/>
         </w:rPr>
       </w:pPr>
@@ -2459,6 +2824,7 @@
           <w:i w:val="0"/>
           <w:sz w:val="22"/>
           <w:szCs w:val="22"/>
+          <w:highlight w:val="yellow"/>
           <w:lang w:val="es-ES"/>
         </w:rPr>
         <w:t>La actividad minera metálica presentó incremento significativo en la producción acumulada de</w:t>
@@ -2469,6 +2835,7 @@
           <w:i w:val="0"/>
           <w:sz w:val="22"/>
           <w:szCs w:val="22"/>
+          <w:highlight w:val="yellow"/>
           <w:lang w:val="es-ES"/>
         </w:rPr>
         <w:t xml:space="preserve"> cobre, ante las alzas reportadas por las compañías mineras </w:t>
@@ -2479,6 +2846,7 @@
           <w:i w:val="0"/>
           <w:sz w:val="22"/>
           <w:szCs w:val="22"/>
+          <w:highlight w:val="yellow"/>
           <w:lang w:val="es-ES"/>
         </w:rPr>
         <w:t xml:space="preserve"> </w:t>
@@ -2489,6 +2857,7 @@
           <w:i w:val="0"/>
           <w:sz w:val="22"/>
           <w:szCs w:val="22"/>
+          <w:highlight w:val="yellow"/>
           <w:lang w:val="es-ES"/>
         </w:rPr>
         <w:t xml:space="preserve">Antamina, Las Bambas, </w:t>
@@ -2500,6 +2869,7 @@
           <w:i w:val="0"/>
           <w:sz w:val="22"/>
           <w:szCs w:val="22"/>
+          <w:highlight w:val="yellow"/>
           <w:lang w:val="es-ES"/>
         </w:rPr>
         <w:t>Shouxin</w:t>
@@ -2511,6 +2881,7 @@
           <w:i w:val="0"/>
           <w:sz w:val="22"/>
           <w:szCs w:val="22"/>
+          <w:highlight w:val="yellow"/>
           <w:lang w:val="es-ES"/>
         </w:rPr>
         <w:t xml:space="preserve"> </w:t>
@@ -2522,6 +2893,7 @@
           <w:i w:val="0"/>
           <w:sz w:val="22"/>
           <w:szCs w:val="22"/>
+          <w:highlight w:val="yellow"/>
           <w:lang w:val="es-ES"/>
         </w:rPr>
         <w:t>Peru</w:t>
@@ -2533,6 +2905,7 @@
           <w:i w:val="0"/>
           <w:sz w:val="22"/>
           <w:szCs w:val="22"/>
+          <w:highlight w:val="yellow"/>
           <w:lang w:val="es-ES"/>
         </w:rPr>
         <w:t xml:space="preserve">, Antapaccay, </w:t>
@@ -2544,6 +2917,7 @@
           <w:i w:val="0"/>
           <w:sz w:val="22"/>
           <w:szCs w:val="22"/>
+          <w:highlight w:val="yellow"/>
           <w:lang w:val="es-ES"/>
         </w:rPr>
         <w:t>Norcobre</w:t>
@@ -2555,6 +2929,7 @@
           <w:i w:val="0"/>
           <w:sz w:val="22"/>
           <w:szCs w:val="22"/>
+          <w:highlight w:val="yellow"/>
           <w:lang w:val="es-ES"/>
         </w:rPr>
         <w:t xml:space="preserve">, </w:t>
@@ -2566,6 +2941,7 @@
           <w:i w:val="0"/>
           <w:sz w:val="22"/>
           <w:szCs w:val="22"/>
+          <w:highlight w:val="yellow"/>
           <w:lang w:val="es-ES"/>
         </w:rPr>
         <w:t>Colquisiri</w:t>
@@ -2577,6 +2953,7 @@
           <w:i w:val="0"/>
           <w:sz w:val="22"/>
           <w:szCs w:val="22"/>
+          <w:highlight w:val="yellow"/>
           <w:lang w:val="es-ES"/>
         </w:rPr>
         <w:t xml:space="preserve"> y los aportes de Minera </w:t>
@@ -2588,6 +2965,7 @@
           <w:i w:val="0"/>
           <w:sz w:val="22"/>
           <w:szCs w:val="22"/>
+          <w:highlight w:val="yellow"/>
           <w:lang w:val="es-ES"/>
         </w:rPr>
         <w:t>Argentum</w:t>
@@ -2599,6 +2977,7 @@
           <w:i w:val="0"/>
           <w:sz w:val="22"/>
           <w:szCs w:val="22"/>
+          <w:highlight w:val="yellow"/>
           <w:lang w:val="es-ES"/>
         </w:rPr>
         <w:t xml:space="preserve">, </w:t>
@@ -2610,6 +2989,7 @@
           <w:i w:val="0"/>
           <w:sz w:val="22"/>
           <w:szCs w:val="22"/>
+          <w:highlight w:val="yellow"/>
           <w:lang w:val="es-ES"/>
         </w:rPr>
         <w:t>Agromin</w:t>
@@ -2621,6 +3001,7 @@
           <w:i w:val="0"/>
           <w:sz w:val="22"/>
           <w:szCs w:val="22"/>
+          <w:highlight w:val="yellow"/>
           <w:lang w:val="es-ES"/>
         </w:rPr>
         <w:t xml:space="preserve"> La Bonita y </w:t>
@@ -2632,6 +3013,7 @@
           <w:i w:val="0"/>
           <w:sz w:val="22"/>
           <w:szCs w:val="22"/>
+          <w:highlight w:val="yellow"/>
           <w:lang w:val="es-ES"/>
         </w:rPr>
         <w:t>Shuntur</w:t>
@@ -2643,6 +3025,7 @@
           <w:i w:val="0"/>
           <w:sz w:val="22"/>
           <w:szCs w:val="22"/>
+          <w:highlight w:val="yellow"/>
           <w:lang w:val="es-ES"/>
         </w:rPr>
         <w:t xml:space="preserve">; en la producción de </w:t>
@@ -2653,6 +3036,7 @@
           <w:i w:val="0"/>
           <w:sz w:val="22"/>
           <w:szCs w:val="22"/>
+          <w:highlight w:val="yellow"/>
           <w:lang w:val="es-ES"/>
         </w:rPr>
         <w:t>zinc</w:t>
@@ -2663,6 +3047,7 @@
           <w:i w:val="0"/>
           <w:sz w:val="22"/>
           <w:szCs w:val="22"/>
+          <w:highlight w:val="yellow"/>
           <w:lang w:val="es-ES"/>
         </w:rPr>
         <w:t xml:space="preserve"> fue relevante la participación de las compañías mineras Los </w:t>
@@ -2674,6 +3059,7 @@
           <w:i w:val="0"/>
           <w:sz w:val="22"/>
           <w:szCs w:val="22"/>
+          <w:highlight w:val="yellow"/>
           <w:lang w:val="es-ES"/>
         </w:rPr>
         <w:t>Quenuales</w:t>
@@ -2685,6 +3071,7 @@
           <w:i w:val="0"/>
           <w:sz w:val="22"/>
           <w:szCs w:val="22"/>
+          <w:highlight w:val="yellow"/>
           <w:lang w:val="es-ES"/>
         </w:rPr>
         <w:t xml:space="preserve">, </w:t>
@@ -2696,6 +3083,7 @@
           <w:i w:val="0"/>
           <w:sz w:val="22"/>
           <w:szCs w:val="22"/>
+          <w:highlight w:val="yellow"/>
           <w:lang w:val="es-ES"/>
         </w:rPr>
         <w:t>Shouxin</w:t>
@@ -2707,6 +3095,7 @@
           <w:i w:val="0"/>
           <w:sz w:val="22"/>
           <w:szCs w:val="22"/>
+          <w:highlight w:val="yellow"/>
           <w:lang w:val="es-ES"/>
         </w:rPr>
         <w:t xml:space="preserve"> </w:t>
@@ -2718,6 +3107,7 @@
           <w:i w:val="0"/>
           <w:sz w:val="22"/>
           <w:szCs w:val="22"/>
+          <w:highlight w:val="yellow"/>
           <w:lang w:val="es-ES"/>
         </w:rPr>
         <w:t>Peru</w:t>
@@ -2729,6 +3119,7 @@
           <w:i w:val="0"/>
           <w:sz w:val="22"/>
           <w:szCs w:val="22"/>
+          <w:highlight w:val="yellow"/>
           <w:lang w:val="es-ES"/>
         </w:rPr>
         <w:t xml:space="preserve">, </w:t>
@@ -2740,6 +3131,7 @@
           <w:i w:val="0"/>
           <w:sz w:val="22"/>
           <w:szCs w:val="22"/>
+          <w:highlight w:val="yellow"/>
           <w:lang w:val="es-ES"/>
         </w:rPr>
         <w:t>Nexa</w:t>
@@ -2751,6 +3143,7 @@
           <w:i w:val="0"/>
           <w:sz w:val="22"/>
           <w:szCs w:val="22"/>
+          <w:highlight w:val="yellow"/>
           <w:lang w:val="es-ES"/>
         </w:rPr>
         <w:t xml:space="preserve"> </w:t>
@@ -2762,6 +3155,7 @@
           <w:i w:val="0"/>
           <w:sz w:val="22"/>
           <w:szCs w:val="22"/>
+          <w:highlight w:val="yellow"/>
           <w:lang w:val="es-ES"/>
         </w:rPr>
         <w:t>Resources</w:t>
@@ -2773,6 +3167,7 @@
           <w:i w:val="0"/>
           <w:sz w:val="22"/>
           <w:szCs w:val="22"/>
+          <w:highlight w:val="yellow"/>
           <w:lang w:val="es-ES"/>
         </w:rPr>
         <w:t xml:space="preserve"> </w:t>
@@ -2784,6 +3179,7 @@
           <w:i w:val="0"/>
           <w:sz w:val="22"/>
           <w:szCs w:val="22"/>
+          <w:highlight w:val="yellow"/>
           <w:lang w:val="es-ES"/>
         </w:rPr>
         <w:t>Peru</w:t>
@@ -2795,6 +3191,7 @@
           <w:i w:val="0"/>
           <w:sz w:val="22"/>
           <w:szCs w:val="22"/>
+          <w:highlight w:val="yellow"/>
           <w:lang w:val="es-ES"/>
         </w:rPr>
         <w:t xml:space="preserve">, Chinalco </w:t>
@@ -2806,6 +3203,7 @@
           <w:i w:val="0"/>
           <w:sz w:val="22"/>
           <w:szCs w:val="22"/>
+          <w:highlight w:val="yellow"/>
           <w:lang w:val="es-ES"/>
         </w:rPr>
         <w:t>Peru</w:t>
@@ -2817,6 +3215,7 @@
           <w:i w:val="0"/>
           <w:sz w:val="22"/>
           <w:szCs w:val="22"/>
+          <w:highlight w:val="yellow"/>
           <w:lang w:val="es-ES"/>
         </w:rPr>
         <w:t xml:space="preserve">, Sociedad Minera Corona, </w:t>
@@ -2828,6 +3227,7 @@
           <w:i w:val="0"/>
           <w:sz w:val="22"/>
           <w:szCs w:val="22"/>
+          <w:highlight w:val="yellow"/>
           <w:lang w:val="es-ES"/>
         </w:rPr>
         <w:t>Raura</w:t>
@@ -2839,6 +3239,7 @@
           <w:i w:val="0"/>
           <w:sz w:val="22"/>
           <w:szCs w:val="22"/>
+          <w:highlight w:val="yellow"/>
           <w:lang w:val="es-ES"/>
         </w:rPr>
         <w:t xml:space="preserve">, Catalina Huanca Sociedad Minera y el aporte de Minera </w:t>
@@ -2850,6 +3251,7 @@
           <w:i w:val="0"/>
           <w:sz w:val="22"/>
           <w:szCs w:val="22"/>
+          <w:highlight w:val="yellow"/>
           <w:lang w:val="es-ES"/>
         </w:rPr>
         <w:t>Argentum</w:t>
@@ -2861,6 +3263,7 @@
           <w:i w:val="0"/>
           <w:sz w:val="22"/>
           <w:szCs w:val="22"/>
+          <w:highlight w:val="yellow"/>
           <w:lang w:val="es-ES"/>
         </w:rPr>
         <w:t xml:space="preserve">; </w:t>
@@ -2871,6 +3274,7 @@
           <w:i w:val="0"/>
           <w:sz w:val="22"/>
           <w:szCs w:val="22"/>
+          <w:highlight w:val="yellow"/>
           <w:lang w:val="es-ES"/>
         </w:rPr>
         <w:t xml:space="preserve">en la producción de oro figuraron </w:t>
@@ -2881,6 +3285,7 @@
           <w:i w:val="0"/>
           <w:sz w:val="22"/>
           <w:szCs w:val="22"/>
+          <w:highlight w:val="yellow"/>
           <w:lang w:val="es-ES"/>
         </w:rPr>
         <w:t xml:space="preserve">las compañías mineras Yanacocha, </w:t>
@@ -2892,6 +3297,7 @@
           <w:i w:val="0"/>
           <w:sz w:val="22"/>
           <w:szCs w:val="22"/>
+          <w:highlight w:val="yellow"/>
           <w:lang w:val="es-ES"/>
         </w:rPr>
         <w:t>Coimolache</w:t>
@@ -2903,6 +3309,7 @@
           <w:i w:val="0"/>
           <w:sz w:val="22"/>
           <w:szCs w:val="22"/>
+          <w:highlight w:val="yellow"/>
           <w:lang w:val="es-ES"/>
         </w:rPr>
         <w:t xml:space="preserve">, Las Bambas, La Arena, Veta Dorada, Minera Confianza, Buenaventura, </w:t>
@@ -2914,6 +3321,7 @@
           <w:i w:val="0"/>
           <w:sz w:val="22"/>
           <w:szCs w:val="22"/>
+          <w:highlight w:val="yellow"/>
           <w:lang w:val="es-ES"/>
         </w:rPr>
         <w:t>Yanaquihua</w:t>
@@ -2925,6 +3333,7 @@
           <w:i w:val="0"/>
           <w:sz w:val="22"/>
           <w:szCs w:val="22"/>
+          <w:highlight w:val="yellow"/>
           <w:lang w:val="es-ES"/>
         </w:rPr>
         <w:t xml:space="preserve"> </w:t>
@@ -2935,6 +3344,7 @@
           <w:i w:val="0"/>
           <w:sz w:val="22"/>
           <w:szCs w:val="22"/>
+          <w:highlight w:val="yellow"/>
           <w:lang w:val="es-ES"/>
         </w:rPr>
         <w:t xml:space="preserve">además de la contribución </w:t>
@@ -2945,6 +3355,7 @@
           <w:i w:val="0"/>
           <w:sz w:val="22"/>
           <w:szCs w:val="22"/>
+          <w:highlight w:val="yellow"/>
           <w:lang w:val="es-ES"/>
         </w:rPr>
         <w:t xml:space="preserve">del Consorcio Minero </w:t>
@@ -2956,6 +3367,7 @@
           <w:i w:val="0"/>
           <w:sz w:val="22"/>
           <w:szCs w:val="22"/>
+          <w:highlight w:val="yellow"/>
           <w:lang w:val="es-ES"/>
         </w:rPr>
         <w:t>Sunec</w:t>
@@ -2967,6 +3379,7 @@
           <w:i w:val="0"/>
           <w:sz w:val="22"/>
           <w:szCs w:val="22"/>
+          <w:highlight w:val="yellow"/>
           <w:lang w:val="es-ES"/>
         </w:rPr>
         <w:t xml:space="preserve">; y en el caso de la producción de hierro fue relevante la participación de las compañías mineras </w:t>
@@ -2978,6 +3391,7 @@
           <w:i w:val="0"/>
           <w:sz w:val="22"/>
           <w:szCs w:val="22"/>
+          <w:highlight w:val="yellow"/>
           <w:lang w:val="es-ES"/>
         </w:rPr>
         <w:t>Shougang</w:t>
@@ -2989,6 +3403,7 @@
           <w:i w:val="0"/>
           <w:sz w:val="22"/>
           <w:szCs w:val="22"/>
+          <w:highlight w:val="yellow"/>
           <w:lang w:val="es-ES"/>
         </w:rPr>
         <w:t xml:space="preserve"> Hierro </w:t>
@@ -3000,6 +3415,7 @@
           <w:i w:val="0"/>
           <w:sz w:val="22"/>
           <w:szCs w:val="22"/>
+          <w:highlight w:val="yellow"/>
           <w:lang w:val="es-ES"/>
         </w:rPr>
         <w:t>Peru</w:t>
@@ -3011,6 +3427,7 @@
           <w:i w:val="0"/>
           <w:sz w:val="22"/>
           <w:szCs w:val="22"/>
+          <w:highlight w:val="yellow"/>
           <w:lang w:val="es-ES"/>
         </w:rPr>
         <w:t xml:space="preserve"> y Minera </w:t>
@@ -3022,6 +3439,7 @@
           <w:i w:val="0"/>
           <w:sz w:val="22"/>
           <w:szCs w:val="22"/>
+          <w:highlight w:val="yellow"/>
           <w:lang w:val="es-ES"/>
         </w:rPr>
         <w:t>Shouxin</w:t>
@@ -3033,6 +3451,7 @@
           <w:i w:val="0"/>
           <w:sz w:val="22"/>
           <w:szCs w:val="22"/>
+          <w:highlight w:val="yellow"/>
           <w:lang w:val="es-ES"/>
         </w:rPr>
         <w:t xml:space="preserve"> </w:t>
@@ -3044,6 +3463,7 @@
           <w:i w:val="0"/>
           <w:sz w:val="22"/>
           <w:szCs w:val="22"/>
+          <w:highlight w:val="yellow"/>
           <w:lang w:val="es-ES"/>
         </w:rPr>
         <w:t>Peru</w:t>
@@ -3055,6 +3475,7 @@
           <w:i w:val="0"/>
           <w:sz w:val="22"/>
           <w:szCs w:val="22"/>
+          <w:highlight w:val="yellow"/>
           <w:lang w:val="es-ES"/>
         </w:rPr>
         <w:t>.</w:t>
@@ -3072,6 +3493,7 @@
       <w:r>
         <w:rPr>
           <w:rFonts w:cstheme="minorHAnsi"/>
+          <w:highlight w:val="yellow"/>
           <w:lang w:val="es-ES"/>
         </w:rPr>
         <w:t xml:space="preserve">El subsector hidrocarburos registró un decrecimiento, explicado por los menores volúmenes acumulados en la producción de petróleo crudo, asociados a resultados negativos de las contratistas </w:t>
@@ -3080,6 +3502,7 @@
       <w:r>
         <w:rPr>
           <w:rFonts w:cstheme="minorHAnsi"/>
+          <w:highlight w:val="yellow"/>
           <w:lang w:val="es-ES"/>
         </w:rPr>
         <w:t>Petrotal</w:t>
@@ -3088,6 +3511,7 @@
       <w:r>
         <w:rPr>
           <w:rFonts w:cstheme="minorHAnsi"/>
+          <w:highlight w:val="yellow"/>
           <w:lang w:val="es-ES"/>
         </w:rPr>
         <w:t xml:space="preserve"> Perú (lote 95), Petroperú (lote Z-69), OIG</w:t>
@@ -3095,6 +3519,7 @@
       <w:r>
         <w:rPr>
           <w:rFonts w:cstheme="minorHAnsi"/>
+          <w:highlight w:val="yellow"/>
           <w:lang w:val="es-ES"/>
         </w:rPr>
         <w:t xml:space="preserve"> Perú</w:t>
@@ -3102,6 +3527,7 @@
       <w:r>
         <w:rPr>
           <w:rFonts w:cstheme="minorHAnsi"/>
+          <w:highlight w:val="yellow"/>
           <w:lang w:val="es-ES"/>
         </w:rPr>
         <w:t xml:space="preserve"> (lote X), </w:t>
@@ -3110,6 +3536,7 @@
       <w:r>
         <w:rPr>
           <w:rFonts w:cstheme="minorHAnsi"/>
+          <w:highlight w:val="yellow"/>
           <w:lang w:val="es-ES"/>
         </w:rPr>
         <w:t>Ucawa</w:t>
@@ -3118,6 +3545,7 @@
       <w:r>
         <w:rPr>
           <w:rFonts w:cstheme="minorHAnsi"/>
+          <w:highlight w:val="yellow"/>
           <w:lang w:val="es-ES"/>
         </w:rPr>
         <w:t xml:space="preserve"> Energy</w:t>
@@ -3125,6 +3553,7 @@
       <w:r>
         <w:rPr>
           <w:rFonts w:cstheme="minorHAnsi"/>
+          <w:highlight w:val="yellow"/>
           <w:lang w:val="es-ES"/>
         </w:rPr>
         <w:t xml:space="preserve"> (lote 131), </w:t>
@@ -3133,6 +3562,7 @@
       <w:r>
         <w:rPr>
           <w:rFonts w:cstheme="minorHAnsi"/>
+          <w:highlight w:val="yellow"/>
           <w:lang w:val="es-ES"/>
         </w:rPr>
         <w:t>Olympic</w:t>
@@ -3141,6 +3571,7 @@
       <w:r>
         <w:rPr>
           <w:rFonts w:cstheme="minorHAnsi"/>
+          <w:highlight w:val="yellow"/>
           <w:lang w:val="es-ES"/>
         </w:rPr>
         <w:t xml:space="preserve"> (lote XIII), UNNA Energía (lotes III y IV) y Corporación del Sur (lote V), así como por la inactividad de los lotes II, </w:t>
@@ -3148,6 +3579,7 @@
       <w:r>
         <w:rPr>
           <w:rFonts w:cstheme="minorHAnsi"/>
+          <w:highlight w:val="yellow"/>
           <w:lang w:val="es-ES"/>
         </w:rPr>
         <w:t xml:space="preserve">VI, </w:t>
@@ -3155,6 +3587,7 @@
       <w:r>
         <w:rPr>
           <w:rFonts w:cstheme="minorHAnsi"/>
+          <w:highlight w:val="yellow"/>
           <w:lang w:val="es-ES"/>
         </w:rPr>
         <w:t>XV y XX. En contraste, la producción de líquidos de gas natural evidenció volúmenes</w:t>
@@ -3162,6 +3595,7 @@
       <w:r>
         <w:rPr>
           <w:rFonts w:cstheme="minorHAnsi"/>
+          <w:highlight w:val="yellow"/>
           <w:lang w:val="es-ES"/>
         </w:rPr>
         <w:t xml:space="preserve"> positivos</w:t>
@@ -3169,6 +3603,7 @@
       <w:r>
         <w:rPr>
           <w:rFonts w:cstheme="minorHAnsi"/>
+          <w:highlight w:val="yellow"/>
           <w:lang w:val="es-ES"/>
         </w:rPr>
         <w:t xml:space="preserve">, impulsados principalmente por Repsol (lote 57) y Pluspetrol </w:t>
@@ -3177,6 +3612,7 @@
       <w:r>
         <w:rPr>
           <w:rFonts w:cstheme="minorHAnsi"/>
+          <w:highlight w:val="yellow"/>
           <w:lang w:val="es-ES"/>
         </w:rPr>
         <w:t>Peru</w:t>
@@ -3185,6 +3621,7 @@
       <w:r>
         <w:rPr>
           <w:rFonts w:cstheme="minorHAnsi"/>
+          <w:highlight w:val="yellow"/>
           <w:lang w:val="es-ES"/>
         </w:rPr>
         <w:t xml:space="preserve"> </w:t>
@@ -3193,6 +3630,7 @@
       <w:r>
         <w:rPr>
           <w:rFonts w:cstheme="minorHAnsi"/>
+          <w:highlight w:val="yellow"/>
           <w:lang w:val="es-ES"/>
         </w:rPr>
         <w:t>Corporation</w:t>
@@ -3201,6 +3639,7 @@
       <w:r>
         <w:rPr>
           <w:rFonts w:cstheme="minorHAnsi"/>
+          <w:highlight w:val="yellow"/>
           <w:lang w:val="es-ES"/>
         </w:rPr>
         <w:t xml:space="preserve"> </w:t>
@@ -3208,6 +3647,7 @@
       <w:r>
         <w:rPr>
           <w:rFonts w:cstheme="minorHAnsi"/>
+          <w:highlight w:val="yellow"/>
           <w:lang w:val="es-ES"/>
         </w:rPr>
         <w:t xml:space="preserve">(lote 56); mientras que, en gas natural, destacaron los incrementos en la producción de Pluspetrol </w:t>
@@ -3216,6 +3656,7 @@
       <w:r>
         <w:rPr>
           <w:rFonts w:cstheme="minorHAnsi"/>
+          <w:highlight w:val="yellow"/>
           <w:lang w:val="es-ES"/>
         </w:rPr>
         <w:t>Per</w:t>
@@ -3223,6 +3664,7 @@
       <w:r>
         <w:rPr>
           <w:rFonts w:cstheme="minorHAnsi"/>
+          <w:highlight w:val="yellow"/>
           <w:lang w:val="es-ES"/>
         </w:rPr>
         <w:t>u</w:t>
@@ -3231,6 +3673,7 @@
       <w:r>
         <w:rPr>
           <w:rFonts w:cstheme="minorHAnsi"/>
+          <w:highlight w:val="yellow"/>
           <w:lang w:val="es-ES"/>
         </w:rPr>
         <w:t xml:space="preserve"> </w:t>
@@ -3239,6 +3682,7 @@
       <w:r>
         <w:rPr>
           <w:rFonts w:cstheme="minorHAnsi"/>
+          <w:highlight w:val="yellow"/>
           <w:lang w:val="es-ES"/>
         </w:rPr>
         <w:t>Corporation</w:t>
@@ -3247,6 +3691,7 @@
       <w:r>
         <w:rPr>
           <w:rFonts w:cstheme="minorHAnsi"/>
+          <w:highlight w:val="yellow"/>
           <w:lang w:val="es-ES"/>
         </w:rPr>
         <w:t xml:space="preserve"> </w:t>
@@ -3254,6 +3699,7 @@
       <w:r>
         <w:rPr>
           <w:rFonts w:cstheme="minorHAnsi"/>
+          <w:highlight w:val="yellow"/>
           <w:lang w:val="es-ES"/>
         </w:rPr>
         <w:t xml:space="preserve">(lote 88), Repsol (lote 57), UNNA Energía (lotes III y IV), </w:t>
@@ -3262,6 +3708,7 @@
       <w:r>
         <w:rPr>
           <w:rFonts w:cstheme="minorHAnsi"/>
+          <w:highlight w:val="yellow"/>
           <w:lang w:val="es-ES"/>
         </w:rPr>
         <w:t>Olympic</w:t>
@@ -3270,6 +3717,7 @@
       <w:r>
         <w:rPr>
           <w:rFonts w:cstheme="minorHAnsi"/>
+          <w:highlight w:val="yellow"/>
           <w:lang w:val="es-ES"/>
         </w:rPr>
         <w:t xml:space="preserve"> (lote XIII), así como los aportes de </w:t>
@@ -3278,6 +3726,7 @@
       <w:r>
         <w:rPr>
           <w:rFonts w:cstheme="minorHAnsi"/>
+          <w:highlight w:val="yellow"/>
           <w:lang w:val="es-ES"/>
         </w:rPr>
         <w:t>Inexport</w:t>
@@ -3286,6 +3735,7 @@
       <w:r>
         <w:rPr>
           <w:rFonts w:cstheme="minorHAnsi"/>
+          <w:highlight w:val="yellow"/>
           <w:lang w:val="es-ES"/>
         </w:rPr>
         <w:t xml:space="preserve"> </w:t>
@@ -3294,6 +3744,7 @@
       <w:r>
         <w:rPr>
           <w:rFonts w:cstheme="minorHAnsi"/>
+          <w:highlight w:val="yellow"/>
           <w:lang w:val="es-ES"/>
         </w:rPr>
         <w:t>Service</w:t>
@@ -3302,6 +3753,7 @@
       <w:r>
         <w:rPr>
           <w:rFonts w:cstheme="minorHAnsi"/>
+          <w:highlight w:val="yellow"/>
           <w:lang w:val="es-ES"/>
         </w:rPr>
         <w:t xml:space="preserve"> (lote I).</w:t>

</xml_diff>